<commit_message>
Subiendo archivos relaciones al proyecto
</commit_message>
<xml_diff>
--- a/Proyecto.docx
+++ b/Proyecto.docx
@@ -129,17 +129,8 @@
           <w:sz w:val="28"/>
           <w:szCs w:val="28"/>
         </w:rPr>
-        <w:t xml:space="preserve">Proyecto </w:t>
+        <w:t>Proyecto Intermodular</w:t>
       </w:r>
-      <w:proofErr w:type="spellStart"/>
-      <w:r>
-        <w:rPr>
-          <w:sz w:val="28"/>
-          <w:szCs w:val="28"/>
-        </w:rPr>
-        <w:t>Intermodular</w:t>
-      </w:r>
-      <w:proofErr w:type="spellEnd"/>
     </w:p>
     <w:p>
       <w:pPr>
@@ -217,25 +208,43 @@
         <w:tabs>
           <w:tab w:val="left" w:pos="4114"/>
         </w:tabs>
-        <w:jc w:val="center"/>
         <w:rPr>
           <w:sz w:val="28"/>
           <w:szCs w:val="28"/>
         </w:rPr>
       </w:pPr>
-      <w:r>
+    </w:p>
+    <w:p>
+      <w:pPr>
+        <w:tabs>
+          <w:tab w:val="left" w:pos="4114"/>
+        </w:tabs>
+        <w:ind w:left="708"/>
         <w:rPr>
           <w:sz w:val="28"/>
           <w:szCs w:val="28"/>
         </w:rPr>
-        <w:t>Poner vuestros apellidos</w:t>
+      </w:pPr>
+      <w:r>
+        <w:rPr>
+          <w:sz w:val="28"/>
+          <w:szCs w:val="28"/>
+        </w:rPr>
+        <w:t>Javier</w:t>
       </w:r>
       <w:r>
         <w:rPr>
           <w:sz w:val="28"/>
           <w:szCs w:val="28"/>
         </w:rPr>
-        <w:t xml:space="preserve"> y correos</w:t>
+        <w:t xml:space="preserve"> Cases </w:t>
+      </w:r>
+      <w:r>
+        <w:rPr>
+          <w:sz w:val="28"/>
+          <w:szCs w:val="28"/>
+        </w:rPr>
+        <w:t>Verdeguer</w:t>
       </w:r>
     </w:p>
     <w:p>
@@ -243,7 +252,7 @@
         <w:tabs>
           <w:tab w:val="left" w:pos="4114"/>
         </w:tabs>
-        <w:ind w:left="708"/>
+        <w:ind w:firstLine="1276"/>
         <w:rPr>
           <w:sz w:val="28"/>
           <w:szCs w:val="28"/>
@@ -254,7 +263,36 @@
           <w:sz w:val="28"/>
           <w:szCs w:val="28"/>
         </w:rPr>
-        <w:t>Javier</w:t>
+        <w:t xml:space="preserve">Email: </w:t>
+      </w:r>
+      <w:hyperlink r:id="rId8" w:history="1">
+        <w:r>
+          <w:rPr>
+            <w:rStyle w:val="Hipervnculo"/>
+            <w:sz w:val="28"/>
+            <w:szCs w:val="28"/>
+          </w:rPr>
+          <w:t>jacave@alumnatflorida.es</w:t>
+        </w:r>
+      </w:hyperlink>
+    </w:p>
+    <w:p>
+      <w:pPr>
+        <w:tabs>
+          <w:tab w:val="left" w:pos="4114"/>
+        </w:tabs>
+        <w:ind w:firstLine="1276"/>
+        <w:rPr>
+          <w:sz w:val="28"/>
+          <w:szCs w:val="28"/>
+        </w:rPr>
+      </w:pPr>
+      <w:r>
+        <w:rPr>
+          <w:sz w:val="28"/>
+          <w:szCs w:val="28"/>
+        </w:rPr>
+        <w:t>Teléfono: 633954843</w:t>
       </w:r>
     </w:p>
     <w:p>
@@ -262,18 +300,75 @@
         <w:tabs>
           <w:tab w:val="left" w:pos="4114"/>
         </w:tabs>
-        <w:ind w:left="708"/>
+        <w:ind w:firstLine="1276"/>
         <w:rPr>
           <w:sz w:val="28"/>
           <w:szCs w:val="28"/>
         </w:rPr>
       </w:pPr>
-      <w:r>
+    </w:p>
+    <w:p>
+      <w:pPr>
+        <w:tabs>
+          <w:tab w:val="left" w:pos="4114"/>
+        </w:tabs>
+        <w:ind w:left="708"/>
         <w:rPr>
           <w:sz w:val="28"/>
           <w:szCs w:val="28"/>
         </w:rPr>
+      </w:pPr>
+      <w:r>
+        <w:rPr>
+          <w:sz w:val="28"/>
+          <w:szCs w:val="28"/>
+        </w:rPr>
         <w:t>Angela</w:t>
+      </w:r>
+      <w:r>
+        <w:rPr>
+          <w:sz w:val="28"/>
+          <w:szCs w:val="28"/>
+        </w:rPr>
+        <w:t xml:space="preserve"> Camrena Morant</w:t>
+      </w:r>
+    </w:p>
+    <w:p>
+      <w:pPr>
+        <w:tabs>
+          <w:tab w:val="left" w:pos="4114"/>
+        </w:tabs>
+        <w:ind w:left="1416"/>
+        <w:rPr>
+          <w:sz w:val="28"/>
+          <w:szCs w:val="28"/>
+        </w:rPr>
+      </w:pPr>
+      <w:r>
+        <w:rPr>
+          <w:sz w:val="28"/>
+          <w:szCs w:val="28"/>
+        </w:rPr>
+        <w:t>Email:</w:t>
+      </w:r>
+    </w:p>
+    <w:p>
+      <w:pPr>
+        <w:tabs>
+          <w:tab w:val="left" w:pos="4114"/>
+        </w:tabs>
+        <w:ind w:left="1416"/>
+        <w:rPr>
+          <w:sz w:val="28"/>
+          <w:szCs w:val="28"/>
+        </w:rPr>
+      </w:pPr>
+      <w:r>
+        <w:rPr>
+          <w:sz w:val="28"/>
+          <w:szCs w:val="28"/>
+        </w:rPr>
+        <w:t>Teléfono:</w:t>
       </w:r>
     </w:p>
     <w:p>
@@ -307,7 +402,7 @@
         <w:tabs>
           <w:tab w:val="left" w:pos="4114"/>
         </w:tabs>
-        <w:ind w:left="708" w:right="567" w:firstLine="708"/>
+        <w:ind w:right="567" w:firstLine="1276"/>
         <w:rPr>
           <w:sz w:val="28"/>
           <w:szCs w:val="28"/>
@@ -318,7 +413,50 @@
           <w:sz w:val="28"/>
           <w:szCs w:val="28"/>
         </w:rPr>
-        <w:t>absaal@alumantflorida.es</w:t>
+        <w:t>Email</w:t>
+      </w:r>
+      <w:r>
+        <w:rPr>
+          <w:sz w:val="28"/>
+          <w:szCs w:val="28"/>
+        </w:rPr>
+        <w:t xml:space="preserve">: </w:t>
+      </w:r>
+      <w:hyperlink r:id="rId9" w:history="1">
+        <w:r>
+          <w:rPr>
+            <w:rStyle w:val="Hipervnculo"/>
+            <w:sz w:val="28"/>
+            <w:szCs w:val="28"/>
+          </w:rPr>
+          <w:t>absaal@alumantflorida.es</w:t>
+        </w:r>
+      </w:hyperlink>
+    </w:p>
+    <w:p>
+      <w:pPr>
+        <w:tabs>
+          <w:tab w:val="left" w:pos="4114"/>
+        </w:tabs>
+        <w:ind w:right="567" w:firstLine="1276"/>
+        <w:rPr>
+          <w:sz w:val="28"/>
+          <w:szCs w:val="28"/>
+        </w:rPr>
+      </w:pPr>
+      <w:r>
+        <w:rPr>
+          <w:sz w:val="28"/>
+          <w:szCs w:val="28"/>
+        </w:rPr>
+        <w:t xml:space="preserve">Teléfono: </w:t>
+      </w:r>
+      <w:r>
+        <w:rPr>
+          <w:sz w:val="28"/>
+          <w:szCs w:val="28"/>
+        </w:rPr>
+        <w:t>627847558</w:t>
       </w:r>
     </w:p>
     <w:p>
@@ -390,7 +528,97 @@
     </w:p>
     <w:p>
       <w:pPr>
-        <w:pStyle w:val="Ttulo"/>
+        <w:pStyle w:val="Ttulo1"/>
+        <w:rPr>
+          <w:rFonts w:eastAsiaTheme="minorEastAsia"/>
+          <w:b/>
+          <w:bCs/>
+          <w:color w:val="000000" w:themeColor="text1"/>
+        </w:rPr>
+      </w:pPr>
+      <w:r>
+        <w:rPr>
+          <w:rFonts w:eastAsiaTheme="minorEastAsia"/>
+          <w:b/>
+          <w:bCs/>
+          <w:color w:val="000000" w:themeColor="text1"/>
+        </w:rPr>
+        <w:t xml:space="preserve">1. </w:t>
+      </w:r>
+      <w:r>
+        <w:rPr>
+          <w:rFonts w:eastAsiaTheme="minorEastAsia"/>
+          <w:b/>
+          <w:bCs/>
+          <w:color w:val="000000" w:themeColor="text1"/>
+        </w:rPr>
+        <w:t>Introducción</w:t>
+      </w:r>
+    </w:p>
+    <w:p>
+      <w:r>
+        <w:t xml:space="preserve">La presente memoria documenta el diseño y desarrollo de </w:t>
+      </w:r>
+      <w:r>
+        <w:rPr>
+          <w:b/>
+          <w:bCs/>
+        </w:rPr>
+        <w:t>"Ayuda al Viajero"</w:t>
+      </w:r>
+      <w:r>
+        <w:t>, una aplicación web creada como Proyecto Intermodular para el ciclo de 1º de DAW (Desarrollo de Aplicaciones Web). El propósito de este documento es explicar paso a paso cómo se ha construido la plataforma, integrando en un solo trabajo práctico todos los conocimientos adquiridos durante el curso: desde la creación de la base de datos y la programación del servidor, hasta el diseño visual de la página.</w:t>
+      </w:r>
+    </w:p>
+    <w:p>
+      <w:pPr>
+        <w:tabs>
+          <w:tab w:val="left" w:pos="4114"/>
+        </w:tabs>
+        <w:rPr>
+          <w:rFonts w:eastAsiaTheme="minorEastAsia" w:cs="Calibri"/>
+        </w:rPr>
+      </w:pPr>
+      <w:r>
+        <w:rPr>
+          <w:rFonts w:eastAsiaTheme="minorEastAsia" w:cs="Calibri"/>
+        </w:rPr>
+        <w:t>Ayuda al viajero es una web orientada al turismo que permite a los usuarios buscar destinos, leer reseñas y consultar guías de otros usuarios, esta web es el resultado de nuestro Proyecto.</w:t>
+      </w:r>
+    </w:p>
+    <w:p>
+      <w:pPr>
+        <w:pStyle w:val="Ttulo1"/>
+        <w:rPr>
+          <w:rFonts w:eastAsiaTheme="minorEastAsia"/>
+          <w:b/>
+          <w:bCs/>
+          <w:color w:val="000000" w:themeColor="text1"/>
+        </w:rPr>
+      </w:pPr>
+      <w:r>
+        <w:rPr>
+          <w:rFonts w:eastAsiaTheme="minorEastAsia"/>
+          <w:b/>
+          <w:bCs/>
+          <w:color w:val="000000" w:themeColor="text1"/>
+        </w:rPr>
+        <w:t>2</w:t>
+      </w:r>
+      <w:r>
+        <w:rPr>
+          <w:rFonts w:eastAsiaTheme="minorEastAsia"/>
+          <w:b/>
+          <w:bCs/>
+          <w:color w:val="000000" w:themeColor="text1"/>
+        </w:rPr>
+        <w:t>. Valoración cualitativa de la evolución, desarrollo y resultado final del proyecto</w:t>
+      </w:r>
+    </w:p>
+    <w:p/>
+    <w:p>
+      <w:pPr>
+        <w:pStyle w:val="Prrafodelista"/>
         <w:numPr>
           <w:ilvl w:val="0"/>
           <w:numId w:val="8"/>
@@ -398,61 +626,20 @@
         <w:tabs>
           <w:tab w:val="left" w:pos="4114"/>
         </w:tabs>
-        <w:ind w:left="284" w:hanging="284"/>
-        <w:jc w:val="both"/>
-        <w:rPr>
-          <w:rFonts w:eastAsiaTheme="minorEastAsia" w:cstheme="minorBidi"/>
-          <w:b/>
-          <w:bCs/>
+        <w:spacing w:after="0" w:line="240" w:lineRule="auto"/>
+        <w:rPr>
+          <w:rFonts w:eastAsiaTheme="minorEastAsia"/>
+          <w:vanish/>
+          <w:spacing w:val="-10"/>
+          <w:kern w:val="28"/>
           <w:sz w:val="36"/>
           <w:szCs w:val="36"/>
         </w:rPr>
       </w:pPr>
-      <w:r>
-        <w:rPr>
-          <w:rFonts w:eastAsiaTheme="minorEastAsia" w:cstheme="minorBidi"/>
-          <w:b/>
-          <w:bCs/>
-          <w:sz w:val="36"/>
-          <w:szCs w:val="36"/>
-        </w:rPr>
-        <w:lastRenderedPageBreak/>
-        <w:t>Introducción</w:t>
-      </w:r>
     </w:p>
     <w:p>
       <w:pPr>
-        <w:tabs>
-          <w:tab w:val="left" w:pos="4114"/>
-        </w:tabs>
-        <w:rPr>
-          <w:rFonts w:eastAsiaTheme="minorEastAsia" w:cs="Calibri"/>
-        </w:rPr>
-      </w:pPr>
-      <w:r>
-        <w:rPr>
-          <w:rFonts w:eastAsiaTheme="minorEastAsia" w:cs="Calibri"/>
-        </w:rPr>
-        <w:t xml:space="preserve">Ayuda al viajero es una web orientada al turismo que permite a los usuarios buscar destinos, leer reseñas y consultar guías de otros usuarios, esta web es el resultado de nuestro Proyecto </w:t>
-      </w:r>
-      <w:proofErr w:type="spellStart"/>
-      <w:r>
-        <w:rPr>
-          <w:rFonts w:eastAsiaTheme="minorEastAsia" w:cs="Calibri"/>
-        </w:rPr>
-        <w:t>Intermodular</w:t>
-      </w:r>
-      <w:proofErr w:type="spellEnd"/>
-      <w:r>
-        <w:rPr>
-          <w:rFonts w:eastAsiaTheme="minorEastAsia" w:cs="Calibri"/>
-        </w:rPr>
-        <w:t xml:space="preserve"> donde se integran los conocimientos y requisitos de Bases de Datos, Programación, Sistemas, Lenguaje de Marcas, Entornos y Fol.</w:t>
-      </w:r>
-    </w:p>
-    <w:p>
-      <w:pPr>
-        <w:pStyle w:val="Ttulo"/>
+        <w:pStyle w:val="Prrafodelista"/>
         <w:numPr>
           <w:ilvl w:val="0"/>
           <w:numId w:val="8"/>
@@ -460,29 +647,17 @@
         <w:tabs>
           <w:tab w:val="left" w:pos="4114"/>
         </w:tabs>
-        <w:spacing w:after="0"/>
-        <w:ind w:left="720" w:hanging="540"/>
-        <w:jc w:val="both"/>
-        <w:rPr>
-          <w:rFonts w:eastAsiaTheme="minorEastAsia" w:cstheme="minorBidi"/>
-          <w:b/>
-          <w:bCs/>
+        <w:spacing w:after="0" w:line="240" w:lineRule="auto"/>
+        <w:rPr>
+          <w:rFonts w:eastAsiaTheme="minorEastAsia"/>
+          <w:vanish/>
+          <w:spacing w:val="-10"/>
+          <w:kern w:val="28"/>
           <w:sz w:val="36"/>
           <w:szCs w:val="36"/>
         </w:rPr>
       </w:pPr>
-      <w:r>
-        <w:rPr>
-          <w:rFonts w:eastAsiaTheme="minorEastAsia" w:cstheme="minorBidi"/>
-          <w:b/>
-          <w:bCs/>
-          <w:sz w:val="36"/>
-          <w:szCs w:val="36"/>
-        </w:rPr>
-        <w:t>Objetivos</w:t>
-      </w:r>
     </w:p>
-    <w:p/>
     <w:p>
       <w:pPr>
         <w:pStyle w:val="Ttulo"/>
@@ -494,20 +669,20 @@
           <w:tab w:val="left" w:pos="4114"/>
         </w:tabs>
         <w:spacing w:after="0"/>
-        <w:ind w:left="720" w:firstLine="0"/>
+        <w:ind w:firstLine="0"/>
         <w:rPr>
           <w:rFonts w:asciiTheme="minorHAnsi" w:eastAsiaTheme="minorEastAsia" w:hAnsiTheme="minorHAnsi" w:cstheme="minorBidi"/>
-          <w:sz w:val="36"/>
-          <w:szCs w:val="36"/>
+          <w:sz w:val="32"/>
+          <w:szCs w:val="32"/>
         </w:rPr>
       </w:pPr>
       <w:r>
         <w:rPr>
           <w:rFonts w:asciiTheme="minorHAnsi" w:eastAsiaTheme="minorEastAsia" w:hAnsiTheme="minorHAnsi" w:cstheme="minorBidi"/>
-          <w:sz w:val="36"/>
-          <w:szCs w:val="36"/>
-        </w:rPr>
-        <w:t>Objetivos Generales</w:t>
+          <w:sz w:val="32"/>
+          <w:szCs w:val="32"/>
+        </w:rPr>
+        <w:t>Evolución y Desarrollo:</w:t>
       </w:r>
     </w:p>
     <w:p/>
@@ -574,16 +749,75 @@
         <w:tabs>
           <w:tab w:val="left" w:pos="4114"/>
         </w:tabs>
-        <w:ind w:left="720" w:hanging="27"/>
+        <w:ind w:firstLine="0"/>
+        <w:rPr>
+          <w:sz w:val="32"/>
+          <w:szCs w:val="32"/>
+        </w:rPr>
       </w:pPr>
       <w:r>
         <w:rPr>
           <w:rFonts w:eastAsiaTheme="minorEastAsia"/>
-          <w:sz w:val="36"/>
-          <w:szCs w:val="36"/>
-        </w:rPr>
-        <w:t>Objetivos particulares</w:t>
+          <w:sz w:val="32"/>
+          <w:szCs w:val="32"/>
+        </w:rPr>
+        <w:t>Resultado Final:</w:t>
       </w:r>
+    </w:p>
+    <w:p>
+      <w:pPr>
+        <w:pStyle w:val="NormalWeb"/>
+        <w:ind w:left="502"/>
+      </w:pPr>
+      <w:r>
+        <w:t>Estamos</w:t>
+      </w:r>
+      <w:r>
+        <w:t xml:space="preserve"> contentos</w:t>
+      </w:r>
+      <w:r>
+        <w:t xml:space="preserve"> con el resultado. Hemos conseguido una web funcional que no solo permite consultar información</w:t>
+      </w:r>
+      <w:r>
+        <w:t xml:space="preserve"> además de editar  y </w:t>
+      </w:r>
+      <w:r>
+        <w:t>listar,</w:t>
+      </w:r>
+      <w:r>
+        <w:t xml:space="preserve"> sino que ofrece una experiencia real de usuario</w:t>
+      </w:r>
+      <w:r>
+        <w:t>, viendo que tiene unas limitaciones.</w:t>
+      </w:r>
+    </w:p>
+    <w:p>
+      <w:pPr>
+        <w:pStyle w:val="NormalWeb"/>
+        <w:ind w:left="502"/>
+      </w:pPr>
+      <w:r>
+        <w:t xml:space="preserve">Visualmente, el diseño es limpio y centrado. Creemos que "Ayuda al Viajero" cumple con todos los objetivos planteados al inicio y demuestra una </w:t>
+      </w:r>
+      <w:r>
+        <w:t>combinación</w:t>
+      </w:r>
+      <w:r>
+        <w:t xml:space="preserve"> sólida de todos los módulos del ciclo.</w:t>
+      </w:r>
+    </w:p>
+    <w:p>
+      <w:pPr>
+        <w:pStyle w:val="Prrafodelista"/>
+        <w:tabs>
+          <w:tab w:val="left" w:pos="4114"/>
+        </w:tabs>
+        <w:ind w:left="567"/>
+        <w:rPr>
+          <w:sz w:val="32"/>
+          <w:szCs w:val="32"/>
+        </w:rPr>
+      </w:pPr>
     </w:p>
     <w:p>
       <w:pPr>
@@ -621,145 +855,6 @@
     </w:p>
     <w:p>
       <w:pPr>
-        <w:pStyle w:val="Prrafodelista"/>
-        <w:numPr>
-          <w:ilvl w:val="1"/>
-          <w:numId w:val="2"/>
-        </w:numPr>
-        <w:rPr>
-          <w:rFonts w:cs="Calibri"/>
-        </w:rPr>
-      </w:pPr>
-      <w:r>
-        <w:rPr>
-          <w:rFonts w:cs="Calibri"/>
-        </w:rPr>
-        <w:t xml:space="preserve">Diseño y Usabilidad: Crear una interfaz </w:t>
-      </w:r>
-      <w:proofErr w:type="spellStart"/>
-      <w:r>
-        <w:rPr>
-          <w:rFonts w:cs="Calibri"/>
-        </w:rPr>
-        <w:t>responsif</w:t>
-      </w:r>
-      <w:proofErr w:type="spellEnd"/>
-      <w:r>
-        <w:rPr>
-          <w:rFonts w:cs="Calibri"/>
-        </w:rPr>
-        <w:t xml:space="preserve"> y atractiva utilizando HTML5 y CSS3 que garantice una buena experiencia de usuario.</w:t>
-      </w:r>
-    </w:p>
-    <w:p>
-      <w:pPr>
-        <w:pStyle w:val="Prrafodelista"/>
-        <w:ind w:left="2148"/>
-        <w:rPr>
-          <w:rFonts w:cs="Calibri"/>
-        </w:rPr>
-      </w:pPr>
-    </w:p>
-    <w:p>
-      <w:pPr>
-        <w:pStyle w:val="Prrafodelista"/>
-        <w:numPr>
-          <w:ilvl w:val="1"/>
-          <w:numId w:val="2"/>
-        </w:numPr>
-        <w:rPr>
-          <w:rFonts w:cs="Calibri"/>
-        </w:rPr>
-      </w:pPr>
-      <w:r>
-        <w:rPr>
-          <w:rFonts w:cs="Calibri"/>
-        </w:rPr>
-        <w:t>Gestión de Datos: Diseñar y normalizar una base de datos relacional en MySQL para almacenar de forma eficiente la información de usuarios, destinos, guías y reseñas.</w:t>
-      </w:r>
-    </w:p>
-    <w:p>
-      <w:pPr>
-        <w:pStyle w:val="Prrafodelista"/>
-        <w:rPr>
-          <w:rFonts w:cs="Calibri"/>
-        </w:rPr>
-      </w:pPr>
-    </w:p>
-    <w:p>
-      <w:pPr>
-        <w:pStyle w:val="Prrafodelista"/>
-        <w:numPr>
-          <w:ilvl w:val="1"/>
-          <w:numId w:val="2"/>
-        </w:numPr>
-        <w:rPr>
-          <w:rFonts w:cs="Calibri"/>
-        </w:rPr>
-      </w:pPr>
-      <w:r>
-        <w:rPr>
-          <w:rFonts w:cs="Calibri"/>
-        </w:rPr>
-        <w:t xml:space="preserve">Seguridad y Lógica: Desarrollar el </w:t>
-      </w:r>
-      <w:proofErr w:type="spellStart"/>
-      <w:r>
-        <w:rPr>
-          <w:rFonts w:cs="Calibri"/>
-        </w:rPr>
-        <w:t>backend</w:t>
-      </w:r>
-      <w:proofErr w:type="spellEnd"/>
-      <w:r>
-        <w:rPr>
-          <w:rFonts w:cs="Calibri"/>
-        </w:rPr>
-        <w:t xml:space="preserve"> en PHP utilizando PDO y sentencias preparadas para garantizar la seguridad frente a ataques de inyección SQL.</w:t>
-      </w:r>
-    </w:p>
-    <w:p>
-      <w:pPr>
-        <w:pStyle w:val="Prrafodelista"/>
-        <w:rPr>
-          <w:rFonts w:cs="Calibri"/>
-        </w:rPr>
-      </w:pPr>
-    </w:p>
-    <w:p>
-      <w:pPr>
-        <w:pStyle w:val="Prrafodelista"/>
-        <w:numPr>
-          <w:ilvl w:val="1"/>
-          <w:numId w:val="2"/>
-        </w:numPr>
-        <w:rPr>
-          <w:rFonts w:cs="Calibri"/>
-        </w:rPr>
-      </w:pPr>
-      <w:r>
-        <w:rPr>
-          <w:rFonts w:cs="Calibri"/>
-        </w:rPr>
-        <w:t xml:space="preserve">Control de Versiones: Mantener un historial de cambios profesional mediante el uso de Git y </w:t>
-      </w:r>
-      <w:proofErr w:type="spellStart"/>
-      <w:r>
-        <w:rPr>
-          <w:rFonts w:cs="Calibri"/>
-        </w:rPr>
-        <w:t>Sourcetree</w:t>
-      </w:r>
-      <w:proofErr w:type="spellEnd"/>
-      <w:r>
-        <w:rPr>
-          <w:rFonts w:cs="Calibri"/>
-        </w:rPr>
-        <w:t>.</w:t>
-      </w:r>
-    </w:p>
-    <w:p>
-      <w:pPr>
         <w:pStyle w:val="Ttulo"/>
         <w:numPr>
           <w:ilvl w:val="0"/>
@@ -786,257 +881,10 @@
           <w:sz w:val="36"/>
           <w:szCs w:val="36"/>
         </w:rPr>
-        <w:t>Implementación</w:t>
-      </w:r>
-    </w:p>
-    <w:p>
-      <w:pPr>
-        <w:pStyle w:val="Prrafodelista"/>
-        <w:tabs>
-          <w:tab w:val="left" w:pos="4114"/>
-        </w:tabs>
-        <w:ind w:left="284"/>
-      </w:pPr>
-      <w:r>
-        <w:t xml:space="preserve">Para cubrir todas las demandas del proyecto, se han utilizado las </w:t>
-      </w:r>
-      <w:r>
-        <w:rPr>
-          <w:b/>
-          <w:bCs/>
-        </w:rPr>
-        <w:t>herramientas software</w:t>
-      </w:r>
-      <w:r>
-        <w:t xml:space="preserve"> expuestas a continuación.</w:t>
-      </w:r>
-    </w:p>
-    <w:p>
-      <w:pPr>
-        <w:pStyle w:val="Ttulo"/>
-        <w:numPr>
-          <w:ilvl w:val="1"/>
-          <w:numId w:val="8"/>
-        </w:numPr>
-        <w:tabs>
-          <w:tab w:val="left" w:pos="4114"/>
-        </w:tabs>
-        <w:ind w:left="1134" w:firstLine="0"/>
-        <w:jc w:val="both"/>
-        <w:rPr>
-          <w:rFonts w:asciiTheme="minorHAnsi" w:eastAsiaTheme="minorEastAsia" w:hAnsiTheme="minorHAnsi" w:cstheme="minorBidi"/>
-          <w:sz w:val="24"/>
-          <w:szCs w:val="24"/>
-        </w:rPr>
-      </w:pPr>
-      <w:r>
-        <w:rPr>
-          <w:rFonts w:asciiTheme="minorHAnsi" w:eastAsiaTheme="minorEastAsia" w:hAnsiTheme="minorHAnsi" w:cstheme="minorBidi"/>
-          <w:sz w:val="24"/>
-          <w:szCs w:val="24"/>
-        </w:rPr>
-        <w:t xml:space="preserve">MySQL y </w:t>
+        <w:t xml:space="preserve">Referencia a las </w:t>
       </w:r>
       <w:proofErr w:type="spellStart"/>
       <w:r>
-        <w:rPr>
-          <w:rFonts w:asciiTheme="minorHAnsi" w:eastAsiaTheme="minorEastAsia" w:hAnsiTheme="minorHAnsi" w:cstheme="minorBidi"/>
-          <w:sz w:val="24"/>
-          <w:szCs w:val="24"/>
-        </w:rPr>
-        <w:t>PhP</w:t>
-      </w:r>
-      <w:r>
-        <w:rPr>
-          <w:rFonts w:asciiTheme="minorHAnsi" w:eastAsiaTheme="minorEastAsia" w:hAnsiTheme="minorHAnsi" w:cstheme="minorBidi"/>
-          <w:sz w:val="24"/>
-          <w:szCs w:val="24"/>
-        </w:rPr>
-        <w:t>Myadmin</w:t>
-      </w:r>
-      <w:proofErr w:type="spellEnd"/>
-    </w:p>
-    <w:p>
-      <w:pPr>
-        <w:ind w:firstLine="1418"/>
-      </w:pPr>
-      <w:r>
-        <w:t>Para la Crear y Gestionar nuestras Bases de datos</w:t>
-      </w:r>
-    </w:p>
-    <w:p>
-      <w:pPr>
-        <w:pStyle w:val="Ttulo"/>
-        <w:numPr>
-          <w:ilvl w:val="1"/>
-          <w:numId w:val="8"/>
-        </w:numPr>
-        <w:tabs>
-          <w:tab w:val="left" w:pos="4114"/>
-        </w:tabs>
-        <w:ind w:left="1134" w:firstLine="0"/>
-        <w:jc w:val="both"/>
-        <w:rPr>
-          <w:rFonts w:asciiTheme="minorHAnsi" w:eastAsiaTheme="minorEastAsia" w:hAnsiTheme="minorHAnsi" w:cstheme="minorBidi"/>
-          <w:sz w:val="24"/>
-          <w:szCs w:val="24"/>
-        </w:rPr>
-      </w:pPr>
-      <w:r>
-        <w:rPr>
-          <w:rFonts w:asciiTheme="minorHAnsi" w:eastAsiaTheme="minorEastAsia" w:hAnsiTheme="minorHAnsi" w:cstheme="minorBidi"/>
-          <w:sz w:val="24"/>
-          <w:szCs w:val="24"/>
-        </w:rPr>
-        <w:t>Visual Studio Code</w:t>
-      </w:r>
-    </w:p>
-    <w:p>
-      <w:pPr>
-        <w:ind w:firstLine="1418"/>
-      </w:pPr>
-      <w:r>
-        <w:t>Para poder crear y diseñar nuestro código para la Web</w:t>
-      </w:r>
-    </w:p>
-    <w:p>
-      <w:pPr>
-        <w:pStyle w:val="Ttulo"/>
-        <w:numPr>
-          <w:ilvl w:val="1"/>
-          <w:numId w:val="8"/>
-        </w:numPr>
-        <w:tabs>
-          <w:tab w:val="left" w:pos="4114"/>
-        </w:tabs>
-        <w:ind w:left="1134" w:firstLine="0"/>
-        <w:jc w:val="both"/>
-        <w:rPr>
-          <w:rFonts w:asciiTheme="minorHAnsi" w:eastAsiaTheme="minorEastAsia" w:hAnsiTheme="minorHAnsi" w:cstheme="minorBidi"/>
-          <w:sz w:val="24"/>
-          <w:szCs w:val="24"/>
-        </w:rPr>
-      </w:pPr>
-      <w:proofErr w:type="spellStart"/>
-      <w:r>
-        <w:rPr>
-          <w:rFonts w:asciiTheme="minorHAnsi" w:eastAsiaTheme="minorEastAsia" w:hAnsiTheme="minorHAnsi" w:cstheme="minorBidi"/>
-          <w:sz w:val="24"/>
-          <w:szCs w:val="24"/>
-        </w:rPr>
-        <w:t>SourceTree</w:t>
-      </w:r>
-      <w:proofErr w:type="spellEnd"/>
-      <w:r>
-        <w:rPr>
-          <w:rFonts w:asciiTheme="minorHAnsi" w:eastAsiaTheme="minorEastAsia" w:hAnsiTheme="minorHAnsi" w:cstheme="minorBidi"/>
-          <w:sz w:val="24"/>
-          <w:szCs w:val="24"/>
-        </w:rPr>
-        <w:t xml:space="preserve"> GIT</w:t>
-      </w:r>
-    </w:p>
-    <w:p>
-      <w:pPr>
-        <w:ind w:firstLine="1418"/>
-      </w:pPr>
-      <w:r>
-        <w:t>Para poder trabajar con GIT, crear un repositorio y trabajar en conjunto con los del grupo</w:t>
-      </w:r>
-    </w:p>
-    <w:p/>
-    <w:p>
-      <w:pPr>
-        <w:pStyle w:val="Ttulo"/>
-        <w:numPr>
-          <w:ilvl w:val="1"/>
-          <w:numId w:val="8"/>
-        </w:numPr>
-        <w:tabs>
-          <w:tab w:val="left" w:pos="4114"/>
-        </w:tabs>
-        <w:ind w:left="1134" w:firstLine="0"/>
-        <w:jc w:val="both"/>
-        <w:rPr>
-          <w:rFonts w:asciiTheme="minorHAnsi" w:eastAsiaTheme="minorEastAsia" w:hAnsiTheme="minorHAnsi" w:cstheme="minorBidi"/>
-          <w:sz w:val="24"/>
-          <w:szCs w:val="24"/>
-        </w:rPr>
-      </w:pPr>
-      <w:r>
-        <w:rPr>
-          <w:rFonts w:asciiTheme="minorHAnsi" w:eastAsiaTheme="minorEastAsia" w:hAnsiTheme="minorHAnsi" w:cstheme="minorBidi"/>
-          <w:sz w:val="24"/>
-          <w:szCs w:val="24"/>
-        </w:rPr>
-        <w:lastRenderedPageBreak/>
-        <w:t>Trello</w:t>
-      </w:r>
-    </w:p>
-    <w:p>
-      <w:pPr>
-        <w:ind w:firstLine="1418"/>
-      </w:pPr>
-      <w:r>
-        <w:t xml:space="preserve">Para elaborar una planificación de nuestras tareas y así poder entregarlas a tiempo </w:t>
-      </w:r>
-    </w:p>
-    <w:p>
-      <w:pPr>
-        <w:pStyle w:val="Ttulo"/>
-        <w:numPr>
-          <w:ilvl w:val="1"/>
-          <w:numId w:val="8"/>
-        </w:numPr>
-        <w:tabs>
-          <w:tab w:val="left" w:pos="4114"/>
-        </w:tabs>
-        <w:ind w:left="1134" w:firstLine="0"/>
-        <w:jc w:val="both"/>
-        <w:rPr>
-          <w:rFonts w:asciiTheme="minorHAnsi" w:eastAsiaTheme="minorEastAsia" w:hAnsiTheme="minorHAnsi" w:cstheme="minorBidi"/>
-          <w:sz w:val="24"/>
-          <w:szCs w:val="24"/>
-        </w:rPr>
-      </w:pPr>
-      <w:r>
-        <w:rPr>
-          <w:rFonts w:asciiTheme="minorHAnsi" w:eastAsiaTheme="minorEastAsia" w:hAnsiTheme="minorHAnsi" w:cstheme="minorBidi"/>
-          <w:sz w:val="24"/>
-          <w:szCs w:val="24"/>
-        </w:rPr>
-        <w:t>Draw.io</w:t>
-      </w:r>
-    </w:p>
-    <w:p>
-      <w:pPr>
-        <w:tabs>
-          <w:tab w:val="left" w:pos="4114"/>
-        </w:tabs>
-        <w:ind w:firstLine="1418"/>
-      </w:pPr>
-      <w:r>
-        <w:t xml:space="preserve">Sirve para poder diseñar nuestra Entidad </w:t>
-      </w:r>
-      <w:r>
-        <w:t>Relación</w:t>
-      </w:r>
-      <w:r>
-        <w:t xml:space="preserve">, además de UML </w:t>
-      </w:r>
-    </w:p>
-    <w:p>
-      <w:pPr>
-        <w:pStyle w:val="Ttulo"/>
-        <w:numPr>
-          <w:ilvl w:val="0"/>
-          <w:numId w:val="8"/>
-        </w:numPr>
-        <w:tabs>
-          <w:tab w:val="left" w:pos="4114"/>
-        </w:tabs>
-        <w:ind w:left="284" w:hanging="284"/>
-        <w:jc w:val="both"/>
         <w:rPr>
           <w:rFonts w:asciiTheme="minorHAnsi" w:eastAsiaTheme="minorEastAsia" w:hAnsiTheme="minorHAnsi" w:cstheme="minorBidi"/>
           <w:b/>
@@ -1044,430 +892,314 @@
           <w:sz w:val="36"/>
           <w:szCs w:val="36"/>
         </w:rPr>
-      </w:pPr>
-      <w:r>
-        <w:rPr>
-          <w:rFonts w:asciiTheme="minorHAnsi" w:eastAsiaTheme="minorEastAsia" w:hAnsiTheme="minorHAnsi" w:cstheme="minorBidi"/>
-          <w:b/>
-          <w:bCs/>
+        <w:t>URLs</w:t>
+      </w:r>
+      <w:proofErr w:type="spellEnd"/>
+    </w:p>
+    <w:p>
+      <w:pPr>
+        <w:tabs>
+          <w:tab w:val="left" w:pos="4114"/>
+        </w:tabs>
+        <w:rPr>
+          <w:rFonts w:eastAsiaTheme="minorEastAsia"/>
           <w:sz w:val="36"/>
           <w:szCs w:val="36"/>
         </w:rPr>
-        <w:t>Fases en la realización del proyect</w:t>
-      </w:r>
+      </w:pPr>
+    </w:p>
+    <w:p>
+      <w:pPr>
+        <w:tabs>
+          <w:tab w:val="left" w:pos="4114"/>
+        </w:tabs>
+        <w:rPr>
+          <w:rFonts w:eastAsiaTheme="minorEastAsia"/>
+          <w:sz w:val="32"/>
+          <w:szCs w:val="32"/>
+        </w:rPr>
+      </w:pPr>
       <w:r>
         <w:rPr>
-          <w:rFonts w:asciiTheme="minorHAnsi" w:eastAsiaTheme="minorEastAsia" w:hAnsiTheme="minorHAnsi" w:cstheme="minorBidi"/>
-          <w:b/>
-          <w:bCs/>
-          <w:sz w:val="36"/>
-          <w:szCs w:val="36"/>
-        </w:rPr>
-        <w:t>o</w:t>
+          <w:rFonts w:eastAsiaTheme="minorEastAsia"/>
+          <w:sz w:val="32"/>
+          <w:szCs w:val="32"/>
+        </w:rPr>
+        <w:t>Repositorio Git</w:t>
       </w:r>
     </w:p>
     <w:p>
       <w:pPr>
-        <w:pStyle w:val="Ttulo"/>
-        <w:numPr>
-          <w:ilvl w:val="1"/>
-          <w:numId w:val="8"/>
-        </w:numPr>
         <w:tabs>
           <w:tab w:val="left" w:pos="4114"/>
         </w:tabs>
-        <w:ind w:left="851" w:hanging="142"/>
-        <w:jc w:val="both"/>
-        <w:rPr>
-          <w:rFonts w:asciiTheme="minorHAnsi" w:eastAsiaTheme="minorEastAsia" w:hAnsiTheme="minorHAnsi" w:cstheme="minorBidi"/>
-          <w:sz w:val="24"/>
-          <w:szCs w:val="24"/>
+        <w:rPr>
+          <w:rFonts w:eastAsiaTheme="minorEastAsia"/>
+          <w:sz w:val="36"/>
+          <w:szCs w:val="36"/>
+        </w:rPr>
+      </w:pPr>
+    </w:p>
+    <w:p>
+      <w:pPr>
+        <w:tabs>
+          <w:tab w:val="left" w:pos="4114"/>
+        </w:tabs>
+        <w:rPr>
+          <w:rFonts w:eastAsiaTheme="minorEastAsia"/>
+          <w:sz w:val="32"/>
+          <w:szCs w:val="32"/>
         </w:rPr>
       </w:pPr>
       <w:r>
         <w:rPr>
-          <w:rFonts w:asciiTheme="minorHAnsi" w:eastAsiaTheme="minorEastAsia" w:hAnsiTheme="minorHAnsi" w:cstheme="minorBidi"/>
-          <w:sz w:val="24"/>
-          <w:szCs w:val="24"/>
-        </w:rPr>
-        <w:t>Bases de Dat</w:t>
+          <w:rFonts w:eastAsiaTheme="minorEastAsia"/>
+          <w:sz w:val="32"/>
+          <w:szCs w:val="32"/>
+        </w:rPr>
+        <w:t>S</w:t>
       </w:r>
       <w:r>
         <w:rPr>
-          <w:rFonts w:asciiTheme="minorHAnsi" w:eastAsiaTheme="minorEastAsia" w:hAnsiTheme="minorHAnsi" w:cstheme="minorBidi"/>
-          <w:sz w:val="24"/>
-          <w:szCs w:val="24"/>
-        </w:rPr>
-        <w:t>o</w:t>
+          <w:rFonts w:eastAsiaTheme="minorEastAsia"/>
+          <w:sz w:val="32"/>
+          <w:szCs w:val="32"/>
+        </w:rPr>
+        <w:t>QL</w:t>
       </w:r>
       <w:r>
         <w:rPr>
-          <w:rFonts w:asciiTheme="minorHAnsi" w:eastAsiaTheme="minorEastAsia" w:hAnsiTheme="minorHAnsi" w:cstheme="minorBidi"/>
-          <w:sz w:val="24"/>
-          <w:szCs w:val="24"/>
-        </w:rPr>
-        <w:t>s</w:t>
+          <w:rFonts w:eastAsiaTheme="minorEastAsia"/>
+          <w:sz w:val="32"/>
+          <w:szCs w:val="32"/>
+        </w:rPr>
+        <w:t>, Entidad</w:t>
+      </w:r>
+      <w:r>
+        <w:rPr>
+          <w:rFonts w:eastAsiaTheme="minorEastAsia"/>
+          <w:sz w:val="32"/>
+          <w:szCs w:val="32"/>
+        </w:rPr>
+        <w:t xml:space="preserve"> </w:t>
+      </w:r>
+      <w:r>
+        <w:rPr>
+          <w:rFonts w:eastAsiaTheme="minorEastAsia"/>
+          <w:sz w:val="32"/>
+          <w:szCs w:val="32"/>
+        </w:rPr>
+        <w:t>Relación</w:t>
+      </w:r>
+      <w:r>
+        <w:rPr>
+          <w:rFonts w:eastAsiaTheme="minorEastAsia"/>
+          <w:sz w:val="32"/>
+          <w:szCs w:val="32"/>
+        </w:rPr>
+        <w:t xml:space="preserve"> y </w:t>
+      </w:r>
+      <w:r>
+        <w:rPr>
+          <w:rFonts w:eastAsiaTheme="minorEastAsia"/>
+          <w:sz w:val="32"/>
+          <w:szCs w:val="32"/>
+        </w:rPr>
+        <w:t xml:space="preserve"> </w:t>
+      </w:r>
+      <w:r>
+        <w:rPr>
+          <w:rFonts w:eastAsiaTheme="minorEastAsia"/>
+          <w:sz w:val="32"/>
+          <w:szCs w:val="32"/>
+        </w:rPr>
+        <w:t>Sentencias:</w:t>
       </w:r>
     </w:p>
     <w:p>
       <w:pPr>
-        <w:ind w:left="708"/>
-        <w:rPr>
-          <w:rFonts w:ascii="Calibri" w:hAnsi="Calibri" w:cs="Calibri"/>
+        <w:tabs>
+          <w:tab w:val="left" w:pos="4114"/>
+        </w:tabs>
+        <w:rPr>
+          <w:rFonts w:eastAsiaTheme="minorEastAsia"/>
+        </w:rPr>
+      </w:pPr>
+      <w:hyperlink r:id="rId10" w:history="1">
+        <w:r>
+          <w:rPr>
+            <w:rStyle w:val="Hipervnculo"/>
+            <w:rFonts w:eastAsiaTheme="minorEastAsia"/>
+          </w:rPr>
+          <w:t>TABLAS ER PROYECTO.docx</w:t>
+        </w:r>
+      </w:hyperlink>
+    </w:p>
+    <w:p>
+      <w:pPr>
+        <w:tabs>
+          <w:tab w:val="left" w:pos="4114"/>
+        </w:tabs>
+        <w:rPr>
+          <w:rFonts w:eastAsiaTheme="minorEastAsia"/>
+        </w:rPr>
+      </w:pPr>
+      <w:hyperlink r:id="rId11" w:history="1">
+        <w:proofErr w:type="spellStart"/>
+        <w:r>
+          <w:rPr>
+            <w:rStyle w:val="Hipervnculo"/>
+            <w:rFonts w:eastAsiaTheme="minorEastAsia"/>
+          </w:rPr>
+          <w:t>ayuda_al_viajero.sql</w:t>
+        </w:r>
+        <w:proofErr w:type="spellEnd"/>
+      </w:hyperlink>
+    </w:p>
+    <w:p>
+      <w:pPr>
+        <w:tabs>
+          <w:tab w:val="left" w:pos="4114"/>
+        </w:tabs>
+        <w:rPr>
+          <w:rFonts w:eastAsiaTheme="minorEastAsia"/>
+        </w:rPr>
+      </w:pPr>
+    </w:p>
+    <w:p>
+      <w:pPr>
+        <w:tabs>
+          <w:tab w:val="left" w:pos="4114"/>
+        </w:tabs>
+        <w:rPr>
+          <w:rFonts w:eastAsiaTheme="minorEastAsia"/>
         </w:rPr>
       </w:pPr>
       <w:r>
         <w:rPr>
-          <w:rFonts w:ascii="Calibri" w:hAnsi="Calibri" w:cs="Calibri"/>
-        </w:rPr>
-        <w:t>Diagrama Entidad Relación diseñado en DIA</w:t>
+          <w:rFonts w:eastAsiaTheme="minorEastAsia"/>
+        </w:rPr>
+        <w:t>Diagrama UML y Prueba Unitaria</w:t>
+      </w:r>
+      <w:r>
+        <w:rPr>
+          <w:rFonts w:eastAsiaTheme="minorEastAsia"/>
+        </w:rPr>
+        <w:t>:</w:t>
       </w:r>
     </w:p>
     <w:p>
       <w:pPr>
-        <w:ind w:left="708"/>
-        <w:rPr>
-          <w:rFonts w:ascii="Calibri" w:hAnsi="Calibri" w:cs="Calibri"/>
+        <w:tabs>
+          <w:tab w:val="left" w:pos="4114"/>
+        </w:tabs>
+        <w:rPr>
+          <w:rFonts w:eastAsiaTheme="minorEastAsia"/>
+        </w:rPr>
+      </w:pPr>
+      <w:hyperlink r:id="rId12" w:history="1">
+        <w:r>
+          <w:rPr>
+            <w:rStyle w:val="Hipervnculo"/>
+            <w:rFonts w:eastAsiaTheme="minorEastAsia"/>
+          </w:rPr>
+          <w:t>Diagrama U</w:t>
+        </w:r>
+        <w:r>
+          <w:rPr>
+            <w:rStyle w:val="Hipervnculo"/>
+            <w:rFonts w:eastAsiaTheme="minorEastAsia"/>
+          </w:rPr>
+          <w:t>M</w:t>
+        </w:r>
+        <w:r>
+          <w:rPr>
+            <w:rStyle w:val="Hipervnculo"/>
+            <w:rFonts w:eastAsiaTheme="minorEastAsia"/>
+          </w:rPr>
+          <w:t>L.png</w:t>
+        </w:r>
+      </w:hyperlink>
+    </w:p>
+    <w:p>
+      <w:pPr>
+        <w:tabs>
+          <w:tab w:val="left" w:pos="4114"/>
+        </w:tabs>
+        <w:rPr>
+          <w:rFonts w:eastAsiaTheme="minorEastAsia"/>
+        </w:rPr>
+      </w:pPr>
+    </w:p>
+    <w:p>
+      <w:pPr>
+        <w:tabs>
+          <w:tab w:val="left" w:pos="4114"/>
+        </w:tabs>
+        <w:rPr>
+          <w:rFonts w:eastAsiaTheme="minorEastAsia"/>
         </w:rPr>
       </w:pPr>
       <w:r>
         <w:rPr>
-          <w:rFonts w:ascii="Calibri" w:hAnsi="Calibri" w:cs="Calibri"/>
-        </w:rPr>
-        <w:t>Script de creación (DDL) de tablas de la base de datos</w:t>
+          <w:rFonts w:eastAsiaTheme="minorEastAsia"/>
+        </w:rPr>
+        <w:t>Proyecto Intermodular</w:t>
+      </w:r>
+      <w:r>
+        <w:rPr>
+          <w:rFonts w:eastAsiaTheme="minorEastAsia"/>
+        </w:rPr>
+        <w:t>:</w:t>
       </w:r>
     </w:p>
     <w:p>
       <w:pPr>
-        <w:ind w:left="708"/>
-        <w:rPr>
-          <w:rFonts w:ascii="Calibri" w:hAnsi="Calibri" w:cs="Calibri"/>
-        </w:rPr>
-      </w:pPr>
-      <w:r>
-        <w:rPr>
-          <w:rFonts w:ascii="Calibri" w:hAnsi="Calibri" w:cs="Calibri"/>
-        </w:rPr>
-        <w:t>Código de las consultas SQL que se incluyan en el proyecto</w:t>
-      </w:r>
+        <w:tabs>
+          <w:tab w:val="left" w:pos="4114"/>
+        </w:tabs>
+        <w:rPr>
+          <w:rFonts w:eastAsiaTheme="minorEastAsia"/>
+        </w:rPr>
+      </w:pPr>
+      <w:hyperlink r:id="rId13" w:history="1">
+        <w:r>
+          <w:rPr>
+            <w:rStyle w:val="Hipervnculo"/>
+            <w:rFonts w:eastAsiaTheme="minorEastAsia"/>
+          </w:rPr>
+          <w:t>Trello</w:t>
+        </w:r>
+      </w:hyperlink>
     </w:p>
     <w:p>
       <w:pPr>
-        <w:ind w:firstLine="708"/>
-      </w:pPr>
+        <w:tabs>
+          <w:tab w:val="left" w:pos="4114"/>
+        </w:tabs>
+        <w:rPr>
+          <w:rFonts w:eastAsiaTheme="minorEastAsia"/>
+        </w:rPr>
+      </w:pPr>
+      <w:hyperlink r:id="rId14" w:history="1">
+        <w:r>
+          <w:rPr>
+            <w:rStyle w:val="Hipervnculo"/>
+            <w:rFonts w:eastAsiaTheme="minorEastAsia"/>
+          </w:rPr>
+          <w:t>Mockup (Prototipo)</w:t>
+        </w:r>
+      </w:hyperlink>
     </w:p>
     <w:p>
       <w:pPr>
-        <w:pStyle w:val="Ttulo"/>
-        <w:numPr>
-          <w:ilvl w:val="1"/>
-          <w:numId w:val="8"/>
-        </w:numPr>
         <w:tabs>
           <w:tab w:val="left" w:pos="4114"/>
         </w:tabs>
-        <w:ind w:left="851" w:hanging="142"/>
-        <w:jc w:val="both"/>
-        <w:rPr>
-          <w:rFonts w:asciiTheme="minorHAnsi" w:eastAsiaTheme="minorEastAsia" w:hAnsiTheme="minorHAnsi" w:cstheme="minorBidi"/>
-          <w:sz w:val="24"/>
-          <w:szCs w:val="24"/>
-        </w:rPr>
-      </w:pPr>
-      <w:r>
-        <w:rPr>
-          <w:rFonts w:asciiTheme="minorHAnsi" w:eastAsiaTheme="minorEastAsia" w:hAnsiTheme="minorHAnsi" w:cstheme="minorBidi"/>
-          <w:sz w:val="24"/>
-          <w:szCs w:val="24"/>
-        </w:rPr>
-        <w:t>Sistemas</w:t>
-      </w:r>
-    </w:p>
-    <w:p>
-      <w:pPr>
-        <w:ind w:left="708"/>
-      </w:pPr>
-      <w:r>
-        <w:t>Imagen del Repositorio, con enlace, y que se vean los tags creados, además de los colaboradores</w:t>
-      </w:r>
-    </w:p>
-    <w:p>
-      <w:pPr>
-        <w:pStyle w:val="Ttulo"/>
-        <w:numPr>
-          <w:ilvl w:val="1"/>
-          <w:numId w:val="8"/>
-        </w:numPr>
-        <w:tabs>
-          <w:tab w:val="left" w:pos="4114"/>
-        </w:tabs>
-        <w:ind w:left="851" w:hanging="142"/>
-        <w:jc w:val="both"/>
-        <w:rPr>
-          <w:rFonts w:asciiTheme="minorHAnsi" w:eastAsiaTheme="minorEastAsia" w:hAnsiTheme="minorHAnsi" w:cstheme="minorBidi"/>
-          <w:sz w:val="24"/>
-          <w:szCs w:val="24"/>
-        </w:rPr>
-      </w:pPr>
-      <w:r>
-        <w:rPr>
-          <w:rFonts w:asciiTheme="minorHAnsi" w:eastAsiaTheme="minorEastAsia" w:hAnsiTheme="minorHAnsi" w:cstheme="minorBidi"/>
-          <w:sz w:val="24"/>
-          <w:szCs w:val="24"/>
-        </w:rPr>
-        <w:t>Programación</w:t>
-      </w:r>
-    </w:p>
-    <w:p>
-      <w:pPr>
-        <w:ind w:left="708"/>
-      </w:pPr>
-      <w:r>
-        <w:t>E</w:t>
-      </w:r>
-      <w:r>
-        <w:t xml:space="preserve">structura </w:t>
-      </w:r>
-      <w:r>
-        <w:t>MVC, separando</w:t>
-      </w:r>
-      <w:r>
-        <w:t xml:space="preserve"> claramente los Modelos, las Vistas y los Controladores</w:t>
-      </w:r>
-    </w:p>
-    <w:p>
-      <w:pPr>
-        <w:ind w:left="708"/>
-      </w:pPr>
-      <w:r>
-        <w:t xml:space="preserve">Acceso a la </w:t>
-      </w:r>
-      <w:r>
-        <w:t xml:space="preserve"> bbdd </w:t>
-      </w:r>
-      <w:r>
-        <w:t>MySQL</w:t>
-      </w:r>
-      <w:r>
-        <w:t xml:space="preserve"> mediante PDO</w:t>
-      </w:r>
-    </w:p>
-    <w:p>
-      <w:pPr>
-        <w:ind w:left="708"/>
-      </w:pPr>
-      <w:r>
-        <w:t>sistema de autenticación de usuarios</w:t>
-      </w:r>
-    </w:p>
-    <w:p>
-      <w:pPr>
-        <w:ind w:left="708"/>
-      </w:pPr>
-    </w:p>
-    <w:p>
-      <w:pPr>
-        <w:pStyle w:val="Ttulo"/>
-        <w:numPr>
-          <w:ilvl w:val="1"/>
-          <w:numId w:val="8"/>
-        </w:numPr>
-        <w:tabs>
-          <w:tab w:val="left" w:pos="4114"/>
-        </w:tabs>
-        <w:ind w:left="851" w:hanging="142"/>
-        <w:jc w:val="both"/>
-        <w:rPr>
-          <w:rFonts w:asciiTheme="minorHAnsi" w:eastAsiaTheme="minorEastAsia" w:hAnsiTheme="minorHAnsi" w:cstheme="minorBidi"/>
-          <w:sz w:val="24"/>
-          <w:szCs w:val="24"/>
-        </w:rPr>
-      </w:pPr>
-      <w:r>
-        <w:rPr>
-          <w:rFonts w:asciiTheme="minorHAnsi" w:eastAsiaTheme="minorEastAsia" w:hAnsiTheme="minorHAnsi" w:cstheme="minorBidi"/>
-          <w:sz w:val="24"/>
-          <w:szCs w:val="24"/>
-        </w:rPr>
-        <w:t>Lenguaje de Marcas</w:t>
-      </w:r>
-    </w:p>
-    <w:p>
-      <w:pPr>
-        <w:ind w:left="708"/>
-      </w:pPr>
-      <w:r>
-        <w:t xml:space="preserve">Enseñar </w:t>
-      </w:r>
-      <w:proofErr w:type="spellStart"/>
-      <w:r>
-        <w:t>header</w:t>
-      </w:r>
-      <w:proofErr w:type="spellEnd"/>
-      <w:r>
-        <w:t xml:space="preserve">, </w:t>
-      </w:r>
-      <w:proofErr w:type="spellStart"/>
-      <w:r>
-        <w:t>footer</w:t>
-      </w:r>
-      <w:proofErr w:type="spellEnd"/>
-      <w:r>
-        <w:t xml:space="preserve">, etiquetas </w:t>
-      </w:r>
-      <w:proofErr w:type="gramStart"/>
-      <w:r>
-        <w:t>usadas ,</w:t>
-      </w:r>
-      <w:proofErr w:type="gramEnd"/>
-      <w:r>
-        <w:t xml:space="preserve"> además de que la web es </w:t>
-      </w:r>
-      <w:proofErr w:type="spellStart"/>
-      <w:r>
-        <w:t>responsibe</w:t>
-      </w:r>
-      <w:proofErr w:type="spellEnd"/>
-      <w:r>
-        <w:t>, elementos HTML usados y el CSS utilizado</w:t>
-      </w:r>
-    </w:p>
-    <w:p>
-      <w:pPr>
-        <w:pStyle w:val="Ttulo"/>
-        <w:numPr>
-          <w:ilvl w:val="1"/>
-          <w:numId w:val="8"/>
-        </w:numPr>
-        <w:tabs>
-          <w:tab w:val="left" w:pos="4114"/>
-        </w:tabs>
-        <w:ind w:left="851" w:hanging="142"/>
-        <w:jc w:val="both"/>
-        <w:rPr>
-          <w:rFonts w:asciiTheme="minorHAnsi" w:eastAsiaTheme="minorEastAsia" w:hAnsiTheme="minorHAnsi" w:cstheme="minorBidi"/>
-          <w:sz w:val="24"/>
-          <w:szCs w:val="24"/>
-        </w:rPr>
-      </w:pPr>
-      <w:r>
-        <w:rPr>
-          <w:rFonts w:asciiTheme="minorHAnsi" w:eastAsiaTheme="minorEastAsia" w:hAnsiTheme="minorHAnsi" w:cstheme="minorBidi"/>
-          <w:sz w:val="24"/>
-          <w:szCs w:val="24"/>
-        </w:rPr>
-        <w:t>Entornos</w:t>
-      </w:r>
-    </w:p>
-    <w:p>
-      <w:pPr>
-        <w:ind w:left="708"/>
-      </w:pPr>
-      <w:r>
-        <w:t>D</w:t>
-      </w:r>
-      <w:r>
-        <w:t>iagrama UML</w:t>
-      </w:r>
-    </w:p>
-    <w:p>
-      <w:pPr>
-        <w:ind w:left="708"/>
-      </w:pPr>
-      <w:r>
-        <w:t>P</w:t>
-      </w:r>
-      <w:r>
-        <w:t>ruebas unitarias</w:t>
-      </w:r>
-    </w:p>
-    <w:p>
-      <w:pPr>
-        <w:pStyle w:val="Ttulo"/>
-        <w:numPr>
-          <w:ilvl w:val="1"/>
-          <w:numId w:val="8"/>
-        </w:numPr>
-        <w:tabs>
-          <w:tab w:val="left" w:pos="4114"/>
-        </w:tabs>
-        <w:ind w:left="851" w:hanging="142"/>
-        <w:jc w:val="both"/>
-        <w:rPr>
-          <w:rFonts w:asciiTheme="minorHAnsi" w:eastAsiaTheme="minorEastAsia" w:hAnsiTheme="minorHAnsi" w:cstheme="minorBidi"/>
-          <w:sz w:val="24"/>
-          <w:szCs w:val="24"/>
-        </w:rPr>
-      </w:pPr>
-      <w:r>
-        <w:rPr>
-          <w:rFonts w:asciiTheme="minorHAnsi" w:eastAsiaTheme="minorEastAsia" w:hAnsiTheme="minorHAnsi" w:cstheme="minorBidi"/>
-          <w:sz w:val="24"/>
-          <w:szCs w:val="24"/>
-        </w:rPr>
-        <w:t>FOL</w:t>
-      </w:r>
-    </w:p>
-    <w:p>
-      <w:r>
-        <w:t>E</w:t>
-      </w:r>
-      <w:r>
-        <w:t>valuación de riesgos</w:t>
-      </w:r>
-    </w:p>
-    <w:p>
-      <w:r>
-        <w:t xml:space="preserve">Analizar las condiciones </w:t>
-      </w:r>
-      <w:r>
-        <w:t>labórale</w:t>
-      </w:r>
-    </w:p>
-    <w:p>
-      <w:r>
-        <w:t>Identificar las fortalezas, debilidades, amenazas y oportunidades</w:t>
-      </w:r>
-    </w:p>
-    <w:p>
-      <w:r>
-        <w:t>P</w:t>
-      </w:r>
-      <w:r>
-        <w:t>lan de acción para desarrollar las áreas de mejora y potenciar las fortalezas</w:t>
-      </w:r>
-    </w:p>
-    <w:p>
-      <w:pPr>
-        <w:pStyle w:val="Ttulo"/>
-        <w:numPr>
-          <w:ilvl w:val="1"/>
-          <w:numId w:val="8"/>
-        </w:numPr>
-        <w:tabs>
-          <w:tab w:val="left" w:pos="4114"/>
-        </w:tabs>
-        <w:ind w:left="851" w:hanging="142"/>
-        <w:jc w:val="both"/>
-        <w:rPr>
-          <w:rFonts w:asciiTheme="minorHAnsi" w:eastAsiaTheme="minorEastAsia" w:hAnsiTheme="minorHAnsi" w:cstheme="minorBidi"/>
-          <w:sz w:val="24"/>
-          <w:szCs w:val="24"/>
-        </w:rPr>
-      </w:pPr>
-      <w:r>
-        <w:rPr>
-          <w:rFonts w:asciiTheme="minorHAnsi" w:eastAsiaTheme="minorEastAsia" w:hAnsiTheme="minorHAnsi" w:cstheme="minorBidi"/>
-          <w:sz w:val="24"/>
-          <w:szCs w:val="24"/>
-        </w:rPr>
-        <w:t>Ingles</w:t>
-      </w:r>
-    </w:p>
-    <w:p>
-      <w:r>
-        <w:t>Imagen del Trello</w:t>
-      </w:r>
+        <w:rPr>
+          <w:rFonts w:eastAsiaTheme="minorEastAsia"/>
+        </w:rPr>
+      </w:pPr>
     </w:p>
     <w:p>
       <w:pPr>
@@ -1483,380 +1215,11 @@
     </w:p>
     <w:p>
       <w:pPr>
-        <w:pStyle w:val="Ttulo"/>
-        <w:numPr>
-          <w:ilvl w:val="0"/>
-          <w:numId w:val="8"/>
-        </w:numPr>
         <w:tabs>
           <w:tab w:val="left" w:pos="4114"/>
         </w:tabs>
-        <w:ind w:left="284" w:hanging="284"/>
-        <w:jc w:val="both"/>
-        <w:rPr>
-          <w:rFonts w:asciiTheme="minorHAnsi" w:eastAsiaTheme="minorEastAsia" w:hAnsiTheme="minorHAnsi" w:cstheme="minorBidi"/>
-          <w:b/>
-          <w:bCs/>
-          <w:sz w:val="36"/>
-          <w:szCs w:val="36"/>
-        </w:rPr>
-      </w:pPr>
-      <w:r>
-        <w:rPr>
-          <w:rFonts w:asciiTheme="minorHAnsi" w:eastAsiaTheme="minorEastAsia" w:hAnsiTheme="minorHAnsi" w:cstheme="minorBidi"/>
-          <w:b/>
-          <w:bCs/>
-          <w:sz w:val="36"/>
-          <w:szCs w:val="36"/>
-        </w:rPr>
-        <w:lastRenderedPageBreak/>
-        <w:t>Ampliaciones</w:t>
-      </w:r>
-    </w:p>
-    <w:p>
-      <w:pPr>
-        <w:tabs>
-          <w:tab w:val="left" w:pos="4114"/>
-        </w:tabs>
-      </w:pPr>
-    </w:p>
-    <w:p>
-      <w:pPr>
-        <w:tabs>
-          <w:tab w:val="left" w:pos="4114"/>
-        </w:tabs>
-      </w:pPr>
-      <w:r>
-        <w:t>Aquí</w:t>
-      </w:r>
-      <w:r>
-        <w:t xml:space="preserve"> nos podemos inventar todo lo queramos hacer en un futuro como que la </w:t>
-      </w:r>
-      <w:r>
-        <w:t>página</w:t>
-      </w:r>
-      <w:r>
-        <w:t xml:space="preserve"> se pueda traducir a varios idiomas</w:t>
-      </w:r>
-      <w:r>
-        <w:t xml:space="preserve">, </w:t>
-      </w:r>
-      <w:r>
-        <w:t xml:space="preserve">ponerla en </w:t>
-      </w:r>
-      <w:proofErr w:type="gramStart"/>
-      <w:r>
-        <w:t>AWS,  usar</w:t>
-      </w:r>
-      <w:proofErr w:type="gramEnd"/>
-      <w:r>
-        <w:t xml:space="preserve"> algún </w:t>
-      </w:r>
-      <w:proofErr w:type="spellStart"/>
-      <w:r>
-        <w:t>Freamwork</w:t>
-      </w:r>
-      <w:proofErr w:type="spellEnd"/>
-      <w:r>
-        <w:t xml:space="preserve"> (Bootstrap) Poner un </w:t>
-      </w:r>
-      <w:proofErr w:type="spellStart"/>
-      <w:r>
-        <w:t>css</w:t>
-      </w:r>
-      <w:proofErr w:type="spellEnd"/>
-      <w:r>
-        <w:t xml:space="preserve"> </w:t>
-      </w:r>
-      <w:proofErr w:type="spellStart"/>
-      <w:r>
-        <w:t>mas</w:t>
-      </w:r>
-      <w:proofErr w:type="spellEnd"/>
-      <w:r>
-        <w:t xml:space="preserve"> estiloso </w:t>
-      </w:r>
-      <w:r>
-        <w:t>etc.</w:t>
-      </w:r>
-    </w:p>
-    <w:p>
-      <w:pPr>
-        <w:tabs>
-          <w:tab w:val="left" w:pos="4114"/>
-        </w:tabs>
-      </w:pPr>
-      <w:r>
-        <w:t xml:space="preserve">Que al añadir un destino el usuario pueda añadir imágenes de dicho destino </w:t>
-      </w:r>
-    </w:p>
-    <w:p>
-      <w:pPr>
-        <w:tabs>
-          <w:tab w:val="left" w:pos="4114"/>
-        </w:tabs>
-      </w:pPr>
-    </w:p>
-    <w:p>
-      <w:pPr>
-        <w:pStyle w:val="Ttulo"/>
-        <w:numPr>
-          <w:ilvl w:val="0"/>
-          <w:numId w:val="8"/>
-        </w:numPr>
-        <w:tabs>
-          <w:tab w:val="left" w:pos="4114"/>
-        </w:tabs>
-        <w:ind w:left="284" w:hanging="284"/>
-        <w:jc w:val="both"/>
-        <w:rPr>
-          <w:rFonts w:asciiTheme="minorHAnsi" w:eastAsiaTheme="minorEastAsia" w:hAnsiTheme="minorHAnsi" w:cstheme="minorBidi"/>
-          <w:b/>
-          <w:bCs/>
-          <w:sz w:val="36"/>
-          <w:szCs w:val="36"/>
-        </w:rPr>
-      </w:pPr>
-      <w:r>
-        <w:rPr>
-          <w:rFonts w:asciiTheme="minorHAnsi" w:eastAsiaTheme="minorEastAsia" w:hAnsiTheme="minorHAnsi" w:cstheme="minorBidi"/>
-          <w:b/>
-          <w:bCs/>
-          <w:sz w:val="36"/>
-          <w:szCs w:val="36"/>
-        </w:rPr>
-        <w:t>Conclusiones</w:t>
-      </w:r>
-    </w:p>
-    <w:p>
-      <w:pPr>
-        <w:tabs>
-          <w:tab w:val="left" w:pos="4114"/>
-        </w:tabs>
-        <w:rPr>
-          <w:rFonts w:eastAsiaTheme="minorEastAsia"/>
-          <w:sz w:val="36"/>
-          <w:szCs w:val="36"/>
-        </w:rPr>
-      </w:pPr>
-    </w:p>
-    <w:p>
-      <w:pPr>
-        <w:pStyle w:val="Ttulo"/>
-        <w:numPr>
-          <w:ilvl w:val="0"/>
-          <w:numId w:val="8"/>
-        </w:numPr>
-        <w:tabs>
-          <w:tab w:val="left" w:pos="4114"/>
-        </w:tabs>
-        <w:ind w:left="284" w:hanging="284"/>
-        <w:jc w:val="both"/>
-        <w:rPr>
-          <w:rFonts w:asciiTheme="minorHAnsi" w:eastAsiaTheme="minorEastAsia" w:hAnsiTheme="minorHAnsi" w:cstheme="minorBidi"/>
-          <w:b/>
-          <w:bCs/>
-          <w:sz w:val="36"/>
-          <w:szCs w:val="36"/>
-        </w:rPr>
-      </w:pPr>
-      <w:r>
-        <w:rPr>
-          <w:rFonts w:asciiTheme="minorHAnsi" w:eastAsiaTheme="minorEastAsia" w:hAnsiTheme="minorHAnsi" w:cstheme="minorBidi"/>
-          <w:b/>
-          <w:bCs/>
-          <w:sz w:val="36"/>
-          <w:szCs w:val="36"/>
-        </w:rPr>
-        <w:t>Biografía y Webgrafía</w:t>
-      </w:r>
-    </w:p>
-    <w:p>
-      <w:pPr>
-        <w:tabs>
-          <w:tab w:val="left" w:pos="4114"/>
-        </w:tabs>
-      </w:pPr>
-    </w:p>
-    <w:p>
-      <w:pPr>
-        <w:pStyle w:val="Prrafodelista"/>
-        <w:numPr>
-          <w:ilvl w:val="0"/>
-          <w:numId w:val="1"/>
-        </w:numPr>
-        <w:tabs>
-          <w:tab w:val="left" w:pos="4114"/>
-        </w:tabs>
-      </w:pPr>
-      <w:r>
-        <w:t>Biografía</w:t>
-      </w:r>
-    </w:p>
-    <w:p>
-      <w:pPr>
-        <w:tabs>
-          <w:tab w:val="left" w:pos="4114"/>
-        </w:tabs>
         <w:ind w:left="720"/>
       </w:pPr>
-    </w:p>
-    <w:p>
-      <w:pPr>
-        <w:tabs>
-          <w:tab w:val="left" w:pos="4114"/>
-        </w:tabs>
-        <w:ind w:left="360" w:firstLine="708"/>
-      </w:pPr>
-      <w:r>
-        <w:t>Todos los recursos de los profesores</w:t>
-      </w:r>
-    </w:p>
-    <w:p>
-      <w:pPr>
-        <w:tabs>
-          <w:tab w:val="left" w:pos="4114"/>
-        </w:tabs>
-        <w:ind w:left="360" w:firstLine="708"/>
-      </w:pPr>
-    </w:p>
-    <w:p>
-      <w:pPr>
-        <w:tabs>
-          <w:tab w:val="left" w:pos="4114"/>
-        </w:tabs>
-        <w:ind w:left="360" w:firstLine="708"/>
-      </w:pPr>
-      <w:r>
-        <w:t xml:space="preserve">Ejemplo </w:t>
-      </w:r>
-      <w:r>
-        <w:t>de cuando estaba en haciendo yo mi proyecto</w:t>
-      </w:r>
-    </w:p>
-    <w:p>
-      <w:pPr>
-        <w:tabs>
-          <w:tab w:val="left" w:pos="4114"/>
-        </w:tabs>
-        <w:ind w:left="643" w:hanging="283"/>
-      </w:pPr>
-      <w:r>
-        <w:t xml:space="preserve">Pérez González, Pablo (2022). Validación de Formularios en PHP. Enlace: </w:t>
-      </w:r>
-      <w:r>
-        <w:tab/>
-      </w:r>
-      <w:r>
-        <w:tab/>
-      </w:r>
-      <w:r>
-        <w:t>https://aules.edu.gva.es/fp/pluginfile.php/3145797/mod_resource/content/0/Tema%206.%20Validaci%C3%B3%20de%20formularis%20en%20PHP.pdf [Recuperado el 15/02/2022].</w:t>
-      </w:r>
-    </w:p>
-    <w:p>
-      <w:pPr>
-        <w:tabs>
-          <w:tab w:val="left" w:pos="4114"/>
-        </w:tabs>
-        <w:ind w:left="360" w:firstLine="708"/>
-      </w:pPr>
-    </w:p>
-    <w:p>
-      <w:pPr>
-        <w:pStyle w:val="Prrafodelista"/>
-        <w:tabs>
-          <w:tab w:val="left" w:pos="4114"/>
-        </w:tabs>
-        <w:ind w:left="1068"/>
-      </w:pPr>
-    </w:p>
-    <w:p>
-      <w:pPr>
-        <w:pStyle w:val="Prrafodelista"/>
-        <w:numPr>
-          <w:ilvl w:val="0"/>
-          <w:numId w:val="1"/>
-        </w:numPr>
-        <w:tabs>
-          <w:tab w:val="left" w:pos="4114"/>
-        </w:tabs>
-      </w:pPr>
-      <w:r>
-        <w:t>Webgrafía</w:t>
-      </w:r>
-    </w:p>
-    <w:p>
-      <w:pPr>
-        <w:pStyle w:val="Prrafodelista"/>
-        <w:tabs>
-          <w:tab w:val="left" w:pos="4114"/>
-        </w:tabs>
-        <w:ind w:left="1068"/>
-      </w:pPr>
-    </w:p>
-    <w:p>
-      <w:pPr>
-        <w:pStyle w:val="Prrafodelista"/>
-        <w:tabs>
-          <w:tab w:val="left" w:pos="4114"/>
-        </w:tabs>
-        <w:ind w:left="1068"/>
-      </w:pPr>
-      <w:r>
-        <w:t>Todos los recursos que encontréis por internet</w:t>
-      </w:r>
-    </w:p>
-    <w:p>
-      <w:pPr>
-        <w:pStyle w:val="Prrafodelista"/>
-        <w:tabs>
-          <w:tab w:val="left" w:pos="4114"/>
-        </w:tabs>
-        <w:ind w:left="1068"/>
-      </w:pPr>
-    </w:p>
-    <w:p>
-      <w:pPr>
-        <w:pStyle w:val="Prrafodelista"/>
-        <w:tabs>
-          <w:tab w:val="left" w:pos="4114"/>
-        </w:tabs>
-        <w:ind w:left="1068"/>
-      </w:pPr>
-      <w:r>
-        <w:t xml:space="preserve">Ejemplo </w:t>
-      </w:r>
-    </w:p>
-    <w:p>
-      <w:pPr>
-        <w:pStyle w:val="Prrafodelista"/>
-        <w:tabs>
-          <w:tab w:val="left" w:pos="4114"/>
-        </w:tabs>
-        <w:ind w:left="1351" w:hanging="283"/>
-      </w:pPr>
-      <w:r>
-        <w:t xml:space="preserve">Bootstrap (2022). </w:t>
-      </w:r>
-      <w:proofErr w:type="spellStart"/>
-      <w:r>
-        <w:t>Icons</w:t>
-      </w:r>
-      <w:proofErr w:type="spellEnd"/>
-      <w:r>
-        <w:t xml:space="preserve">. Enlace: https://getbootstrap.com/docs/5.0/extend/icons/   </w:t>
-      </w:r>
-      <w:bookmarkStart w:id="0" w:name="_Int_kR8dLIFP"/>
-      <w:proofErr w:type="gramStart"/>
-      <w:r>
-        <w:t xml:space="preserve">   [</w:t>
-      </w:r>
-      <w:bookmarkEnd w:id="0"/>
-      <w:proofErr w:type="gramEnd"/>
-      <w:r>
-        <w:t>Recuperado el 13/04/2022].</w:t>
-      </w:r>
     </w:p>
     <w:p>
       <w:pPr>
@@ -1936,10 +1299,10 @@
       </w:pPr>
     </w:p>
     <w:sectPr>
-      <w:headerReference w:type="default" r:id="rId8"/>
-      <w:footerReference w:type="default" r:id="rId9"/>
-      <w:headerReference w:type="first" r:id="rId10"/>
-      <w:footerReference w:type="first" r:id="rId11"/>
+      <w:headerReference w:type="default" r:id="rId15"/>
+      <w:footerReference w:type="default" r:id="rId16"/>
+      <w:headerReference w:type="first" r:id="rId17"/>
+      <w:footerReference w:type="first" r:id="rId18"/>
       <w:pgSz w:w="11906" w:h="16838"/>
       <w:pgMar w:top="720" w:right="720" w:bottom="720" w:left="720" w:header="510" w:footer="227" w:gutter="0"/>
       <w:cols w:space="708"/>
@@ -2351,9 +1714,6 @@
     <int2:textHash int2:hashCode="4MMz+IGR5TKqwE" int2:id="HBiiRZnF">
       <int2:state int2:value="Rejected" int2:type="spell"/>
     </int2:textHash>
-    <int2:bookmark int2:bookmarkName="_Int_kR8dLIFP" int2:invalidationBookmarkName="" int2:hashCode="uw2UACBHigFjj1" int2:id="xxldivqL">
-      <int2:state int2:value="Rejected" int2:type="gram"/>
-    </int2:bookmark>
   </int2:observations>
   <int2:intelligenceSettings/>
   <int2:onDemandWorkflows/>
@@ -5333,14 +4693,14 @@
   <w:abstractNum w:abstractNumId="27" w15:restartNumberingAfterBreak="0">
     <w:nsid w:val="5F39DBF2"/>
     <w:multiLevelType w:val="multilevel"/>
-    <w:tmpl w:val="DC2046E4"/>
+    <w:tmpl w:val="F10C1BD8"/>
     <w:lvl w:ilvl="0">
       <w:start w:val="1"/>
       <w:numFmt w:val="decimal"/>
       <w:lvlText w:val="%1."/>
       <w:lvlJc w:val="left"/>
       <w:pPr>
-        <w:ind w:left="1352" w:hanging="360"/>
+        <w:ind w:left="502" w:hanging="360"/>
       </w:pPr>
       <w:rPr>
         <w:rFonts w:hint="default"/>
@@ -5356,8 +4716,8 @@
       </w:pPr>
       <w:rPr>
         <w:rFonts w:hint="default"/>
-        <w:sz w:val="24"/>
-        <w:szCs w:val="24"/>
+        <w:sz w:val="32"/>
+        <w:szCs w:val="32"/>
       </w:rPr>
     </w:lvl>
     <w:lvl w:ilvl="2">
@@ -7404,7 +6764,6 @@
     <w:next w:val="Normal"/>
     <w:link w:val="Ttulo3Car"/>
     <w:uiPriority w:val="9"/>
-    <w:semiHidden/>
     <w:unhideWhenUsed/>
     <w:qFormat/>
     <w:rsid w:val="00646121"/>
@@ -7611,7 +6970,6 @@
     <w:basedOn w:val="Fuentedeprrafopredeter"/>
     <w:link w:val="Ttulo3"/>
     <w:uiPriority w:val="9"/>
-    <w:semiHidden/>
     <w:rsid w:val="00646121"/>
     <w:rPr>
       <w:rFonts w:eastAsiaTheme="majorEastAsia" w:cstheme="majorBidi"/>
@@ -7951,6 +7309,58 @@
       <w:spacing w:after="0"/>
     </w:pPr>
   </w:style>
+  <w:style w:type="character" w:styleId="Hipervnculo">
+    <w:name w:val="Hyperlink"/>
+    <w:basedOn w:val="Fuentedeprrafopredeter"/>
+    <w:uiPriority w:val="99"/>
+    <w:unhideWhenUsed/>
+    <w:rsid w:val="003E3D31"/>
+    <w:rPr>
+      <w:color w:val="467886" w:themeColor="hyperlink"/>
+      <w:u w:val="single"/>
+    </w:rPr>
+  </w:style>
+  <w:style w:type="character" w:styleId="Mencinsinresolver">
+    <w:name w:val="Unresolved Mention"/>
+    <w:basedOn w:val="Fuentedeprrafopredeter"/>
+    <w:uiPriority w:val="99"/>
+    <w:semiHidden/>
+    <w:unhideWhenUsed/>
+    <w:rsid w:val="003E3D31"/>
+    <w:rPr>
+      <w:color w:val="605E5C"/>
+      <w:shd w:val="clear" w:color="auto" w:fill="E1DFDD"/>
+    </w:rPr>
+  </w:style>
+  <w:style w:type="paragraph" w:styleId="NormalWeb">
+    <w:name w:val="Normal (Web)"/>
+    <w:basedOn w:val="Normal"/>
+    <w:uiPriority w:val="99"/>
+    <w:semiHidden/>
+    <w:unhideWhenUsed/>
+    <w:rsid w:val="00F3636D"/>
+    <w:pPr>
+      <w:spacing w:before="100" w:beforeAutospacing="1" w:after="100" w:afterAutospacing="1" w:line="240" w:lineRule="auto"/>
+    </w:pPr>
+    <w:rPr>
+      <w:rFonts w:ascii="Times New Roman" w:eastAsia="Times New Roman" w:hAnsi="Times New Roman" w:cs="Times New Roman"/>
+      <w:kern w:val="0"/>
+      <w:lang w:eastAsia="es-ES"/>
+      <w14:ligatures w14:val="none"/>
+    </w:rPr>
+  </w:style>
+  <w:style w:type="character" w:styleId="Hipervnculovisitado">
+    <w:name w:val="FollowedHyperlink"/>
+    <w:basedOn w:val="Fuentedeprrafopredeter"/>
+    <w:uiPriority w:val="99"/>
+    <w:semiHidden/>
+    <w:unhideWhenUsed/>
+    <w:rsid w:val="006A60B2"/>
+    <w:rPr>
+      <w:color w:val="96607D" w:themeColor="followedHyperlink"/>
+      <w:u w:val="single"/>
+    </w:rPr>
+  </w:style>
 </w:styles>
 </file>
 
@@ -8066,10 +7476,12 @@
     <w:rsid w:val="0036297D"/>
     <w:rsid w:val="00477F95"/>
     <w:rsid w:val="00491E33"/>
+    <w:rsid w:val="006518B4"/>
     <w:rsid w:val="0080578B"/>
     <w:rsid w:val="0088165E"/>
     <w:rsid w:val="00881919"/>
     <w:rsid w:val="0096507C"/>
+    <w:rsid w:val="009B0FB2"/>
     <w:rsid w:val="00A710E7"/>
     <w:rsid w:val="00B8101C"/>
     <w:rsid w:val="00B935F1"/>

</xml_diff>

<commit_message>
Añadiendo Archivo y Modificando Proyecto
Se a añadido el archivo que contiene el diagrama UML ademas de las pruebas unitarias y se añadido un enlace directo en el archivo directo desde Proyecto
</commit_message>
<xml_diff>
--- a/Proyecto.docx
+++ b/Proyecto.docx
@@ -413,14 +413,7 @@
           <w:sz w:val="28"/>
           <w:szCs w:val="28"/>
         </w:rPr>
-        <w:t>Email</w:t>
-      </w:r>
-      <w:r>
-        <w:rPr>
-          <w:sz w:val="28"/>
-          <w:szCs w:val="28"/>
-        </w:rPr>
-        <w:t xml:space="preserve">: </w:t>
+        <w:t xml:space="preserve">Email: </w:t>
       </w:r>
       <w:hyperlink r:id="rId9" w:history="1">
         <w:r>
@@ -449,14 +442,7 @@
           <w:sz w:val="28"/>
           <w:szCs w:val="28"/>
         </w:rPr>
-        <w:t xml:space="preserve">Teléfono: </w:t>
-      </w:r>
-      <w:r>
-        <w:rPr>
-          <w:sz w:val="28"/>
-          <w:szCs w:val="28"/>
-        </w:rPr>
-        <w:t>627847558</w:t>
+        <w:t>Teléfono: 627847558</w:t>
       </w:r>
     </w:p>
     <w:p>
@@ -603,16 +589,7 @@
           <w:bCs/>
           <w:color w:val="000000" w:themeColor="text1"/>
         </w:rPr>
-        <w:t>2</w:t>
-      </w:r>
-      <w:r>
-        <w:rPr>
-          <w:rFonts w:eastAsiaTheme="minorEastAsia"/>
-          <w:b/>
-          <w:bCs/>
-          <w:color w:val="000000" w:themeColor="text1"/>
-        </w:rPr>
-        <w:t>. Valoración cualitativa de la evolución, desarrollo y resultado final del proyecto</w:t>
+        <w:t>2. Valoración cualitativa de la evolución, desarrollo y resultado final del proyecto</w:t>
       </w:r>
     </w:p>
     <w:p/>
@@ -770,25 +747,13 @@
         <w:ind w:left="502"/>
       </w:pPr>
       <w:r>
-        <w:t>Estamos</w:t>
-      </w:r>
-      <w:r>
-        <w:t xml:space="preserve"> contentos</w:t>
-      </w:r>
-      <w:r>
-        <w:t xml:space="preserve"> con el resultado. Hemos conseguido una web funcional que no solo permite consultar información</w:t>
-      </w:r>
-      <w:r>
-        <w:t xml:space="preserve"> además de editar  y </w:t>
+        <w:t xml:space="preserve">Estamos contentos con el resultado. Hemos conseguido una web funcional que no solo permite consultar información además de editar  y </w:t>
       </w:r>
       <w:r>
         <w:t>listar,</w:t>
       </w:r>
       <w:r>
-        <w:t xml:space="preserve"> sino que ofrece una experiencia real de usuario</w:t>
-      </w:r>
-      <w:r>
-        <w:t>, viendo que tiene unas limitaciones.</w:t>
+        <w:t xml:space="preserve"> sino que ofrece una experiencia real de usuario, viendo que tiene unas limitaciones.</w:t>
       </w:r>
     </w:p>
     <w:p>
@@ -1021,6 +986,7 @@
         <w:tabs>
           <w:tab w:val="left" w:pos="4114"/>
         </w:tabs>
+        <w:ind w:firstLine="284"/>
         <w:rPr>
           <w:rFonts w:eastAsiaTheme="minorEastAsia"/>
         </w:rPr>
@@ -1040,6 +1006,7 @@
         <w:tabs>
           <w:tab w:val="left" w:pos="4114"/>
         </w:tabs>
+        <w:ind w:firstLine="284"/>
         <w:rPr>
           <w:rFonts w:eastAsiaTheme="minorEastAsia"/>
         </w:rPr>
@@ -1101,35 +1068,10 @@
         <w:r>
           <w:rPr>
             <w:rStyle w:val="Hipervnculo"/>
-            <w:rFonts w:eastAsiaTheme="minorEastAsia"/>
           </w:rPr>
-          <w:t>Diagrama U</w:t>
-        </w:r>
-        <w:r>
-          <w:rPr>
-            <w:rStyle w:val="Hipervnculo"/>
-            <w:rFonts w:eastAsiaTheme="minorEastAsia"/>
-          </w:rPr>
-          <w:t>M</w:t>
-        </w:r>
-        <w:r>
-          <w:rPr>
-            <w:rStyle w:val="Hipervnculo"/>
-            <w:rFonts w:eastAsiaTheme="minorEastAsia"/>
-          </w:rPr>
-          <w:t>L.png</w:t>
+          <w:t>Foto UML y Archivo de pruebas Unitarias</w:t>
         </w:r>
       </w:hyperlink>
-    </w:p>
-    <w:p>
-      <w:pPr>
-        <w:tabs>
-          <w:tab w:val="left" w:pos="4114"/>
-        </w:tabs>
-        <w:rPr>
-          <w:rFonts w:eastAsiaTheme="minorEastAsia"/>
-        </w:rPr>
-      </w:pPr>
     </w:p>
     <w:p>
       <w:pPr>
@@ -6915,6 +6857,7 @@
   <w:style w:type="character" w:default="1" w:styleId="Fuentedeprrafopredeter">
     <w:name w:val="Default Paragraph Font"/>
     <w:uiPriority w:val="1"/>
+    <w:semiHidden/>
     <w:unhideWhenUsed/>
   </w:style>
   <w:style w:type="table" w:default="1" w:styleId="Tablanormal">
@@ -7474,8 +7417,10 @@
     <w:rsid w:val="000A66F8"/>
     <w:rsid w:val="00262083"/>
     <w:rsid w:val="0036297D"/>
+    <w:rsid w:val="004746D1"/>
     <w:rsid w:val="00477F95"/>
     <w:rsid w:val="00491E33"/>
+    <w:rsid w:val="005C050F"/>
     <w:rsid w:val="006518B4"/>
     <w:rsid w:val="0080578B"/>
     <w:rsid w:val="0088165E"/>

</xml_diff>

<commit_message>
se añade el video pitch de ingles del proyecto
</commit_message>
<xml_diff>
--- a/Proyecto.docx
+++ b/Proyecto.docx
@@ -891,6 +891,88 @@
           <w:szCs w:val="32"/>
         </w:rPr>
         <w:t>Repositorio Git</w:t>
+      </w:r>
+    </w:p>
+    <w:p>
+      <w:pPr>
+        <w:tabs>
+          <w:tab w:val="left" w:pos="4114"/>
+        </w:tabs>
+        <w:rPr>
+          <w:rFonts w:eastAsiaTheme="minorEastAsia"/>
+          <w:sz w:val="32"/>
+          <w:szCs w:val="32"/>
+        </w:rPr>
+      </w:pPr>
+    </w:p>
+    <w:p>
+      <w:pPr>
+        <w:tabs>
+          <w:tab w:val="left" w:pos="4114"/>
+        </w:tabs>
+        <w:rPr>
+          <w:rFonts w:eastAsiaTheme="minorEastAsia"/>
+          <w:sz w:val="32"/>
+          <w:szCs w:val="32"/>
+        </w:rPr>
+      </w:pPr>
+      <w:r>
+        <w:rPr>
+          <w:rFonts w:eastAsiaTheme="minorEastAsia"/>
+          <w:sz w:val="32"/>
+          <w:szCs w:val="32"/>
+        </w:rPr>
+        <w:t xml:space="preserve">Video del </w:t>
+      </w:r>
+      <w:proofErr w:type="spellStart"/>
+      <w:r>
+        <w:rPr>
+          <w:rFonts w:eastAsiaTheme="minorEastAsia"/>
+          <w:sz w:val="32"/>
+          <w:szCs w:val="32"/>
+        </w:rPr>
+        <w:t>elevator</w:t>
+      </w:r>
+      <w:proofErr w:type="spellEnd"/>
+      <w:r>
+        <w:rPr>
+          <w:rFonts w:eastAsiaTheme="minorEastAsia"/>
+          <w:sz w:val="32"/>
+          <w:szCs w:val="32"/>
+        </w:rPr>
+        <w:t xml:space="preserve"> pitch</w:t>
+      </w:r>
+    </w:p>
+    <w:p>
+      <w:pPr>
+        <w:tabs>
+          <w:tab w:val="left" w:pos="4114"/>
+        </w:tabs>
+        <w:rPr>
+          <w:rFonts w:eastAsiaTheme="minorEastAsia"/>
+          <w:sz w:val="32"/>
+          <w:szCs w:val="32"/>
+        </w:rPr>
+      </w:pPr>
+    </w:p>
+    <w:p>
+      <w:pPr>
+        <w:tabs>
+          <w:tab w:val="left" w:pos="4114"/>
+        </w:tabs>
+        <w:rPr>
+          <w:rFonts w:eastAsiaTheme="minorEastAsia"/>
+          <w:sz w:val="32"/>
+          <w:szCs w:val="32"/>
+        </w:rPr>
+      </w:pPr>
+      <w:r>
+        <w:rPr>
+          <w:rFonts w:eastAsiaTheme="minorEastAsia"/>
+          <w:sz w:val="32"/>
+          <w:szCs w:val="32"/>
+        </w:rPr>
+        <w:t>https://youtu.be/5iJNyp7yQr0</w:t>
       </w:r>
     </w:p>
     <w:p>
@@ -1524,6 +1606,7 @@
               <w:dataBinding w:prefixMappings="xmlns:ns0='http://purl.org/dc/elements/1.1/' xmlns:ns1='http://schemas.openxmlformats.org/package/2006/metadata/core-properties' " w:xpath="/ns1:coreProperties[1]/ns0:title[1]" w:storeItemID="{6C3C8BC8-F283-45AE-878A-BAB7291924A1}"/>
               <w:text/>
             </w:sdtPr>
+            <w:sdtEndPr/>
             <w:sdtContent>
               <w:r>
                 <w:rPr>
@@ -7393,6 +7476,13 @@
     <w:pitch w:val="variable"/>
     <w:sig w:usb0="E4002EFF" w:usb1="C200247B" w:usb2="00000009" w:usb3="00000000" w:csb0="000001FF" w:csb1="00000000"/>
   </w:font>
+  <w:font w:name="Calibri Light">
+    <w:panose1 w:val="020F0302020204030204"/>
+    <w:charset w:val="00"/>
+    <w:family w:val="swiss"/>
+    <w:pitch w:val="variable"/>
+    <w:sig w:usb0="E4002EFF" w:usb1="C200247B" w:usb2="00000009" w:usb3="00000000" w:csb0="000001FF" w:csb1="00000000"/>
+  </w:font>
 </w:fonts>
 </file>
 
@@ -7416,6 +7506,7 @@
     <w:rsid w:val="00065102"/>
     <w:rsid w:val="000A66F8"/>
     <w:rsid w:val="00262083"/>
+    <w:rsid w:val="002C67FD"/>
     <w:rsid w:val="0036297D"/>
     <w:rsid w:val="004746D1"/>
     <w:rsid w:val="00477F95"/>
@@ -7425,6 +7516,7 @@
     <w:rsid w:val="0080578B"/>
     <w:rsid w:val="0088165E"/>
     <w:rsid w:val="00881919"/>
+    <w:rsid w:val="008D76ED"/>
     <w:rsid w:val="0096507C"/>
     <w:rsid w:val="009B0FB2"/>
     <w:rsid w:val="00A710E7"/>

</xml_diff>

<commit_message>
Añadiendo Link video Demo Web
</commit_message>
<xml_diff>
--- a/Proyecto.docx
+++ b/Proyecto.docx
@@ -179,14 +179,7 @@
           <w:sz w:val="28"/>
           <w:szCs w:val="28"/>
         </w:rPr>
-        <w:t>Participantes</w:t>
-      </w:r>
-      <w:r>
-        <w:rPr>
-          <w:sz w:val="28"/>
-          <w:szCs w:val="28"/>
-        </w:rPr>
-        <w:t xml:space="preserve"> y Correos</w:t>
+        <w:t>Información de los participantes</w:t>
       </w:r>
       <w:r>
         <w:rPr>
@@ -351,6 +344,23 @@
         </w:rPr>
         <w:t>Email:</w:t>
       </w:r>
+      <w:r>
+        <w:rPr>
+          <w:sz w:val="28"/>
+          <w:szCs w:val="28"/>
+        </w:rPr>
+        <w:t xml:space="preserve"> </w:t>
+      </w:r>
+      <w:hyperlink r:id="rId9" w:history="1">
+        <w:r>
+          <w:rPr>
+            <w:rStyle w:val="Hipervnculo"/>
+            <w:sz w:val="28"/>
+            <w:szCs w:val="28"/>
+          </w:rPr>
+          <w:t>ancamo02@alumantflorida.es</w:t>
+        </w:r>
+      </w:hyperlink>
     </w:p>
     <w:p>
       <w:pPr>
@@ -369,6 +379,19 @@
           <w:szCs w:val="28"/>
         </w:rPr>
         <w:t>Teléfono:</w:t>
+      </w:r>
+      <w:r>
+        <w:rPr>
+          <w:rFonts w:ascii="Noto Sans" w:hAnsi="Noto Sans" w:cs="Noto Sans"/>
+        </w:rPr>
+        <w:t xml:space="preserve"> </w:t>
+      </w:r>
+      <w:r>
+        <w:rPr>
+          <w:sz w:val="28"/>
+          <w:szCs w:val="28"/>
+        </w:rPr>
+        <w:t>633752561</w:t>
       </w:r>
     </w:p>
     <w:p>
@@ -415,7 +438,7 @@
         </w:rPr>
         <w:t xml:space="preserve">Email: </w:t>
       </w:r>
-      <w:hyperlink r:id="rId9" w:history="1">
+      <w:hyperlink r:id="rId10" w:history="1">
         <w:r>
           <w:rPr>
             <w:rStyle w:val="Hipervnculo"/>
@@ -846,9 +869,8 @@
           <w:sz w:val="36"/>
           <w:szCs w:val="36"/>
         </w:rPr>
-        <w:t xml:space="preserve">Referencia a las </w:t>
+        <w:t>Referencia a las URL</w:t>
       </w:r>
-      <w:proofErr w:type="spellStart"/>
       <w:r>
         <w:rPr>
           <w:rFonts w:asciiTheme="minorHAnsi" w:eastAsiaTheme="minorEastAsia" w:hAnsiTheme="minorHAnsi" w:cstheme="minorBidi"/>
@@ -857,9 +879,18 @@
           <w:sz w:val="36"/>
           <w:szCs w:val="36"/>
         </w:rPr>
-        <w:t>URLs</w:t>
+        <w:t xml:space="preserve">´ </w:t>
       </w:r>
-      <w:proofErr w:type="spellEnd"/>
+      <w:r>
+        <w:rPr>
+          <w:rFonts w:asciiTheme="minorHAnsi" w:eastAsiaTheme="minorEastAsia" w:hAnsiTheme="minorHAnsi" w:cstheme="minorBidi"/>
+          <w:b/>
+          <w:bCs/>
+          <w:sz w:val="36"/>
+          <w:szCs w:val="36"/>
+        </w:rPr>
+        <w:t>s</w:t>
+      </w:r>
     </w:p>
     <w:p>
       <w:pPr>
@@ -875,20 +906,16 @@
     </w:p>
     <w:p>
       <w:pPr>
-        <w:tabs>
-          <w:tab w:val="left" w:pos="4114"/>
-        </w:tabs>
+        <w:pStyle w:val="Ttulo2"/>
         <w:rPr>
           <w:rFonts w:eastAsiaTheme="minorEastAsia"/>
-          <w:sz w:val="32"/>
-          <w:szCs w:val="32"/>
+          <w:color w:val="000000" w:themeColor="text1"/>
         </w:rPr>
       </w:pPr>
       <w:r>
         <w:rPr>
           <w:rFonts w:eastAsiaTheme="minorEastAsia"/>
-          <w:sz w:val="32"/>
-          <w:szCs w:val="32"/>
+          <w:color w:val="000000" w:themeColor="text1"/>
         </w:rPr>
         <w:t>Repositorio Git</w:t>
       </w:r>
@@ -907,6 +934,22 @@
     </w:p>
     <w:p>
       <w:pPr>
+        <w:pStyle w:val="Ttulo2"/>
+        <w:rPr>
+          <w:rFonts w:eastAsiaTheme="minorEastAsia"/>
+          <w:color w:val="000000" w:themeColor="text1"/>
+        </w:rPr>
+      </w:pPr>
+      <w:r>
+        <w:rPr>
+          <w:rFonts w:eastAsiaTheme="minorEastAsia"/>
+          <w:color w:val="000000" w:themeColor="text1"/>
+        </w:rPr>
+        <w:t>Video del elevator pitch</w:t>
+      </w:r>
+    </w:p>
+    <w:p>
+      <w:pPr>
         <w:tabs>
           <w:tab w:val="left" w:pos="4114"/>
         </w:tabs>
@@ -916,31 +959,67 @@
           <w:szCs w:val="32"/>
         </w:rPr>
       </w:pPr>
-      <w:r>
+    </w:p>
+    <w:p>
+      <w:pPr>
+        <w:tabs>
+          <w:tab w:val="left" w:pos="4114"/>
+        </w:tabs>
+        <w:ind w:firstLine="284"/>
+        <w:rPr>
+          <w:rFonts w:ascii="Calibri" w:eastAsiaTheme="minorEastAsia" w:hAnsi="Calibri" w:cs="Calibri"/>
+        </w:rPr>
+      </w:pPr>
+      <w:hyperlink r:id="rId11" w:history="1">
+        <w:r>
+          <w:rPr>
+            <w:rStyle w:val="Hipervnculo"/>
+            <w:rFonts w:ascii="Calibri" w:eastAsiaTheme="minorEastAsia" w:hAnsi="Calibri" w:cs="Calibri"/>
+          </w:rPr>
+          <w:t>https://youtu.be/5iJNyp7yQr0</w:t>
+        </w:r>
+      </w:hyperlink>
+    </w:p>
+    <w:p>
+      <w:pPr>
+        <w:tabs>
+          <w:tab w:val="left" w:pos="4114"/>
+        </w:tabs>
         <w:rPr>
           <w:rFonts w:eastAsiaTheme="minorEastAsia"/>
           <w:sz w:val="32"/>
           <w:szCs w:val="32"/>
         </w:rPr>
-        <w:t xml:space="preserve">Video del </w:t>
+      </w:pPr>
+    </w:p>
+    <w:p>
+      <w:pPr>
+        <w:pStyle w:val="Ttulo2"/>
+        <w:rPr>
+          <w:rFonts w:eastAsiaTheme="minorEastAsia"/>
+          <w:color w:val="000000" w:themeColor="text1"/>
+        </w:rPr>
+      </w:pPr>
+      <w:r>
+        <w:rPr>
+          <w:rFonts w:eastAsiaTheme="minorEastAsia"/>
+          <w:color w:val="000000" w:themeColor="text1"/>
+        </w:rPr>
+        <w:t>Demo de</w:t>
       </w:r>
-      <w:proofErr w:type="spellStart"/>
       <w:r>
         <w:rPr>
           <w:rFonts w:eastAsiaTheme="minorEastAsia"/>
-          <w:sz w:val="32"/>
-          <w:szCs w:val="32"/>
-        </w:rPr>
-        <w:t>elevator</w:t>
+          <w:color w:val="000000" w:themeColor="text1"/>
+        </w:rPr>
+        <w:t xml:space="preserve"> la</w:t>
       </w:r>
-      <w:proofErr w:type="spellEnd"/>
       <w:r>
         <w:rPr>
           <w:rFonts w:eastAsiaTheme="minorEastAsia"/>
-          <w:sz w:val="32"/>
-          <w:szCs w:val="32"/>
-        </w:rPr>
-        <w:t xml:space="preserve"> pitch</w:t>
+          <w:color w:val="000000" w:themeColor="text1"/>
+        </w:rPr>
+        <w:t xml:space="preserve">  Web</w:t>
       </w:r>
     </w:p>
     <w:p>
@@ -948,32 +1027,20 @@
         <w:tabs>
           <w:tab w:val="left" w:pos="4114"/>
         </w:tabs>
-        <w:rPr>
-          <w:rFonts w:eastAsiaTheme="minorEastAsia"/>
-          <w:sz w:val="32"/>
-          <w:szCs w:val="32"/>
-        </w:rPr>
-      </w:pPr>
-    </w:p>
-    <w:p>
-      <w:pPr>
-        <w:tabs>
-          <w:tab w:val="left" w:pos="4114"/>
-        </w:tabs>
-        <w:rPr>
-          <w:rFonts w:eastAsiaTheme="minorEastAsia"/>
-          <w:sz w:val="32"/>
-          <w:szCs w:val="32"/>
-        </w:rPr>
-      </w:pPr>
-      <w:r>
-        <w:rPr>
-          <w:rFonts w:eastAsiaTheme="minorEastAsia"/>
-          <w:sz w:val="32"/>
-          <w:szCs w:val="32"/>
-        </w:rPr>
-        <w:t>https://youtu.be/5iJNyp7yQr0</w:t>
-      </w:r>
+        <w:ind w:firstLine="284"/>
+        <w:rPr>
+          <w:rFonts w:ascii="Calibri" w:eastAsiaTheme="minorEastAsia" w:hAnsi="Calibri" w:cs="Calibri"/>
+        </w:rPr>
+      </w:pPr>
+      <w:hyperlink r:id="rId12" w:history="1">
+        <w:r>
+          <w:rPr>
+            <w:rStyle w:val="Hipervnculo"/>
+            <w:rFonts w:ascii="Calibri" w:eastAsiaTheme="minorEastAsia" w:hAnsi="Calibri" w:cs="Calibri"/>
+          </w:rPr>
+          <w:t>https://youtu.be/ppaWhiytLRk</w:t>
+        </w:r>
+      </w:hyperlink>
     </w:p>
     <w:p>
       <w:pPr>
@@ -989,76 +1056,51 @@
     </w:p>
     <w:p>
       <w:pPr>
-        <w:tabs>
-          <w:tab w:val="left" w:pos="4114"/>
-        </w:tabs>
+        <w:pStyle w:val="Ttulo2"/>
         <w:rPr>
           <w:rFonts w:eastAsiaTheme="minorEastAsia"/>
-          <w:sz w:val="32"/>
-          <w:szCs w:val="32"/>
+          <w:color w:val="000000" w:themeColor="text1"/>
         </w:rPr>
       </w:pPr>
       <w:r>
         <w:rPr>
           <w:rFonts w:eastAsiaTheme="minorEastAsia"/>
-          <w:sz w:val="32"/>
-          <w:szCs w:val="32"/>
-        </w:rPr>
-        <w:t>S</w:t>
+          <w:color w:val="000000" w:themeColor="text1"/>
+        </w:rPr>
+        <w:t>SQL, Entidad</w:t>
       </w:r>
       <w:r>
         <w:rPr>
           <w:rFonts w:eastAsiaTheme="minorEastAsia"/>
-          <w:sz w:val="32"/>
-          <w:szCs w:val="32"/>
-        </w:rPr>
-        <w:t>QL</w:t>
-      </w:r>
-      <w:r>
-        <w:rPr>
-          <w:rFonts w:eastAsiaTheme="minorEastAsia"/>
-          <w:sz w:val="32"/>
-          <w:szCs w:val="32"/>
-        </w:rPr>
-        <w:t>, Entidad</w:t>
-      </w:r>
-      <w:r>
-        <w:rPr>
-          <w:rFonts w:eastAsiaTheme="minorEastAsia"/>
-          <w:sz w:val="32"/>
-          <w:szCs w:val="32"/>
+          <w:color w:val="000000" w:themeColor="text1"/>
         </w:rPr>
         <w:t xml:space="preserve"> </w:t>
       </w:r>
       <w:r>
         <w:rPr>
           <w:rFonts w:eastAsiaTheme="minorEastAsia"/>
-          <w:sz w:val="32"/>
-          <w:szCs w:val="32"/>
+          <w:color w:val="000000" w:themeColor="text1"/>
         </w:rPr>
         <w:t>Relación</w:t>
       </w:r>
       <w:r>
         <w:rPr>
           <w:rFonts w:eastAsiaTheme="minorEastAsia"/>
-          <w:sz w:val="32"/>
-          <w:szCs w:val="32"/>
+          <w:color w:val="000000" w:themeColor="text1"/>
         </w:rPr>
         <w:t xml:space="preserve"> y </w:t>
       </w:r>
       <w:r>
         <w:rPr>
           <w:rFonts w:eastAsiaTheme="minorEastAsia"/>
-          <w:sz w:val="32"/>
-          <w:szCs w:val="32"/>
+          <w:color w:val="000000" w:themeColor="text1"/>
         </w:rPr>
         <w:t xml:space="preserve"> </w:t>
       </w:r>
       <w:r>
         <w:rPr>
           <w:rFonts w:eastAsiaTheme="minorEastAsia"/>
-          <w:sz w:val="32"/>
-          <w:szCs w:val="32"/>
+          <w:color w:val="000000" w:themeColor="text1"/>
         </w:rPr>
         <w:t>Sentencias:</w:t>
       </w:r>
@@ -1070,14 +1112,14 @@
         </w:tabs>
         <w:ind w:firstLine="284"/>
         <w:rPr>
-          <w:rFonts w:eastAsiaTheme="minorEastAsia"/>
-        </w:rPr>
-      </w:pPr>
-      <w:hyperlink r:id="rId10" w:history="1">
+          <w:rFonts w:ascii="Calibri" w:eastAsiaTheme="minorEastAsia" w:hAnsi="Calibri" w:cs="Calibri"/>
+        </w:rPr>
+      </w:pPr>
+      <w:hyperlink r:id="rId13" w:history="1">
         <w:r>
           <w:rPr>
             <w:rStyle w:val="Hipervnculo"/>
-            <w:rFonts w:eastAsiaTheme="minorEastAsia"/>
+            <w:rFonts w:ascii="Calibri" w:eastAsiaTheme="minorEastAsia" w:hAnsi="Calibri" w:cs="Calibri"/>
           </w:rPr>
           <w:t>TABLAS ER PROYECTO.docx</w:t>
         </w:r>
@@ -1090,15 +1132,15 @@
         </w:tabs>
         <w:ind w:firstLine="284"/>
         <w:rPr>
-          <w:rFonts w:eastAsiaTheme="minorEastAsia"/>
-        </w:rPr>
-      </w:pPr>
-      <w:hyperlink r:id="rId11" w:history="1">
+          <w:rFonts w:ascii="Calibri" w:eastAsiaTheme="minorEastAsia" w:hAnsi="Calibri" w:cs="Calibri"/>
+        </w:rPr>
+      </w:pPr>
+      <w:hyperlink r:id="rId14" w:history="1">
         <w:proofErr w:type="spellStart"/>
         <w:r>
           <w:rPr>
             <w:rStyle w:val="Hipervnculo"/>
-            <w:rFonts w:eastAsiaTheme="minorEastAsia"/>
+            <w:rFonts w:ascii="Calibri" w:eastAsiaTheme="minorEastAsia" w:hAnsi="Calibri" w:cs="Calibri"/>
           </w:rPr>
           <w:t>ayuda_al_viajero.sql</w:t>
         </w:r>
@@ -1117,39 +1159,45 @@
     </w:p>
     <w:p>
       <w:pPr>
-        <w:tabs>
-          <w:tab w:val="left" w:pos="4114"/>
-        </w:tabs>
+        <w:pStyle w:val="Ttulo2"/>
         <w:rPr>
           <w:rFonts w:eastAsiaTheme="minorEastAsia"/>
+          <w:color w:val="000000" w:themeColor="text1"/>
         </w:rPr>
       </w:pPr>
       <w:r>
         <w:rPr>
           <w:rFonts w:eastAsiaTheme="minorEastAsia"/>
+          <w:color w:val="000000" w:themeColor="text1"/>
         </w:rPr>
         <w:t>Diagrama UML y Prueba Unitaria</w:t>
       </w:r>
       <w:r>
         <w:rPr>
           <w:rFonts w:eastAsiaTheme="minorEastAsia"/>
+          <w:color w:val="000000" w:themeColor="text1"/>
         </w:rPr>
         <w:t>:</w:t>
       </w:r>
     </w:p>
     <w:p>
       <w:pPr>
-        <w:tabs>
-          <w:tab w:val="left" w:pos="4114"/>
-        </w:tabs>
-        <w:rPr>
-          <w:rFonts w:eastAsiaTheme="minorEastAsia"/>
-        </w:rPr>
-      </w:pPr>
-      <w:hyperlink r:id="rId12" w:history="1">
+        <w:pStyle w:val="Ttulo2"/>
+        <w:ind w:firstLine="284"/>
+        <w:rPr>
+          <w:rFonts w:ascii="Calibri" w:eastAsiaTheme="minorEastAsia" w:hAnsi="Calibri" w:cs="Calibri"/>
+          <w:color w:val="000000" w:themeColor="text1"/>
+          <w:sz w:val="24"/>
+          <w:szCs w:val="24"/>
+        </w:rPr>
+      </w:pPr>
+      <w:hyperlink r:id="rId15" w:history="1">
         <w:r>
           <w:rPr>
             <w:rStyle w:val="Hipervnculo"/>
+            <w:rFonts w:ascii="Calibri" w:hAnsi="Calibri" w:cs="Calibri"/>
+            <w:sz w:val="24"/>
+            <w:szCs w:val="24"/>
           </w:rPr>
           <w:t>Foto UML y Archivo de pruebas Unitarias</w:t>
         </w:r>
@@ -1157,22 +1205,23 @@
     </w:p>
     <w:p>
       <w:pPr>
-        <w:tabs>
-          <w:tab w:val="left" w:pos="4114"/>
-        </w:tabs>
+        <w:pStyle w:val="Ttulo2"/>
         <w:rPr>
           <w:rFonts w:eastAsiaTheme="minorEastAsia"/>
+          <w:color w:val="000000" w:themeColor="text1"/>
         </w:rPr>
       </w:pPr>
       <w:r>
         <w:rPr>
           <w:rFonts w:eastAsiaTheme="minorEastAsia"/>
+          <w:color w:val="000000" w:themeColor="text1"/>
         </w:rPr>
         <w:t>Proyecto Intermodular</w:t>
       </w:r>
       <w:r>
         <w:rPr>
           <w:rFonts w:eastAsiaTheme="minorEastAsia"/>
+          <w:color w:val="000000" w:themeColor="text1"/>
         </w:rPr>
         <w:t>:</w:t>
       </w:r>
@@ -1182,15 +1231,16 @@
         <w:tabs>
           <w:tab w:val="left" w:pos="4114"/>
         </w:tabs>
-        <w:rPr>
-          <w:rFonts w:eastAsiaTheme="minorEastAsia"/>
-        </w:rPr>
-      </w:pPr>
-      <w:hyperlink r:id="rId13" w:history="1">
+        <w:ind w:firstLine="284"/>
+        <w:rPr>
+          <w:rFonts w:ascii="Calibri" w:eastAsiaTheme="minorEastAsia" w:hAnsi="Calibri" w:cs="Calibri"/>
+        </w:rPr>
+      </w:pPr>
+      <w:hyperlink r:id="rId16" w:history="1">
         <w:r>
           <w:rPr>
             <w:rStyle w:val="Hipervnculo"/>
-            <w:rFonts w:eastAsiaTheme="minorEastAsia"/>
+            <w:rFonts w:ascii="Calibri" w:eastAsiaTheme="minorEastAsia" w:hAnsi="Calibri" w:cs="Calibri"/>
           </w:rPr>
           <w:t>Trello</w:t>
         </w:r>
@@ -1201,15 +1251,16 @@
         <w:tabs>
           <w:tab w:val="left" w:pos="4114"/>
         </w:tabs>
-        <w:rPr>
-          <w:rFonts w:eastAsiaTheme="minorEastAsia"/>
-        </w:rPr>
-      </w:pPr>
-      <w:hyperlink r:id="rId14" w:history="1">
+        <w:ind w:firstLine="284"/>
+        <w:rPr>
+          <w:rFonts w:ascii="Calibri" w:eastAsiaTheme="minorEastAsia" w:hAnsi="Calibri" w:cs="Calibri"/>
+        </w:rPr>
+      </w:pPr>
+      <w:hyperlink r:id="rId17" w:history="1">
         <w:r>
           <w:rPr>
             <w:rStyle w:val="Hipervnculo"/>
-            <w:rFonts w:eastAsiaTheme="minorEastAsia"/>
+            <w:rFonts w:ascii="Calibri" w:eastAsiaTheme="minorEastAsia" w:hAnsi="Calibri" w:cs="Calibri"/>
           </w:rPr>
           <w:t>Mockup (Prototipo)</w:t>
         </w:r>
@@ -1323,10 +1374,10 @@
       </w:pPr>
     </w:p>
     <w:sectPr>
-      <w:headerReference w:type="default" r:id="rId15"/>
-      <w:footerReference w:type="default" r:id="rId16"/>
-      <w:headerReference w:type="first" r:id="rId17"/>
-      <w:footerReference w:type="first" r:id="rId18"/>
+      <w:headerReference w:type="default" r:id="rId18"/>
+      <w:footerReference w:type="default" r:id="rId19"/>
+      <w:headerReference w:type="first" r:id="rId20"/>
+      <w:footerReference w:type="first" r:id="rId21"/>
       <w:pgSz w:w="11906" w:h="16838"/>
       <w:pgMar w:top="720" w:right="720" w:bottom="720" w:left="720" w:header="510" w:footer="227" w:gutter="0"/>
       <w:cols w:space="708"/>
@@ -1370,7 +1421,7 @@
       <w:tabs>
         <w:tab w:val="clear" w:pos="4252"/>
         <w:tab w:val="clear" w:pos="8504"/>
-        <w:tab w:val="left" w:pos="5316"/>
+        <w:tab w:val="left" w:pos="4703"/>
       </w:tabs>
       <w:rPr>
         <w:b/>
@@ -1444,6 +1495,14 @@
           </wp14:sizeRelV>
         </wp:anchor>
       </w:drawing>
+    </w:r>
+    <w:r>
+      <w:rPr>
+        <w:b/>
+        <w:bCs/>
+        <w:color w:val="FFFFFF" w:themeColor="background1"/>
+      </w:rPr>
+      <w:tab/>
     </w:r>
   </w:p>
 </w:ftr>
@@ -1606,7 +1665,6 @@
               <w:dataBinding w:prefixMappings="xmlns:ns0='http://purl.org/dc/elements/1.1/' xmlns:ns1='http://schemas.openxmlformats.org/package/2006/metadata/core-properties' " w:xpath="/ns1:coreProperties[1]/ns0:title[1]" w:storeItemID="{6C3C8BC8-F283-45AE-878A-BAB7291924A1}"/>
               <w:text/>
             </w:sdtPr>
-            <w:sdtEndPr/>
             <w:sdtContent>
               <w:r>
                 <w:rPr>
@@ -6766,7 +6824,6 @@
     <w:next w:val="Normal"/>
     <w:link w:val="Ttulo2Car"/>
     <w:uiPriority w:val="9"/>
-    <w:semiHidden/>
     <w:unhideWhenUsed/>
     <w:qFormat/>
     <w:rsid w:val="00646121"/>
@@ -6940,7 +6997,6 @@
   <w:style w:type="character" w:default="1" w:styleId="Fuentedeprrafopredeter">
     <w:name w:val="Default Paragraph Font"/>
     <w:uiPriority w:val="1"/>
-    <w:semiHidden/>
     <w:unhideWhenUsed/>
   </w:style>
   <w:style w:type="table" w:default="1" w:styleId="Tablanormal">
@@ -6982,7 +7038,6 @@
     <w:basedOn w:val="Fuentedeprrafopredeter"/>
     <w:link w:val="Ttulo2"/>
     <w:uiPriority w:val="9"/>
-    <w:semiHidden/>
     <w:rsid w:val="00646121"/>
     <w:rPr>
       <w:rFonts w:asciiTheme="majorHAnsi" w:eastAsiaTheme="majorEastAsia" w:hAnsiTheme="majorHAnsi" w:cstheme="majorBidi"/>
@@ -7469,15 +7524,15 @@
     <w:pitch w:val="variable"/>
     <w:sig w:usb0="20000287" w:usb1="00000003" w:usb2="00000000" w:usb3="00000000" w:csb0="0000019F" w:csb1="00000000"/>
   </w:font>
-  <w:font w:name="Calibri">
-    <w:panose1 w:val="020F0502020204030204"/>
+  <w:font w:name="Noto Sans">
+    <w:panose1 w:val="020B0502040504020204"/>
     <w:charset w:val="00"/>
     <w:family w:val="swiss"/>
     <w:pitch w:val="variable"/>
-    <w:sig w:usb0="E4002EFF" w:usb1="C200247B" w:usb2="00000009" w:usb3="00000000" w:csb0="000001FF" w:csb1="00000000"/>
+    <w:sig w:usb0="E00002FF" w:usb1="4000201F" w:usb2="08000029" w:usb3="00000000" w:csb0="0000019F" w:csb1="00000000"/>
   </w:font>
-  <w:font w:name="Calibri Light">
-    <w:panose1 w:val="020F0302020204030204"/>
+  <w:font w:name="Calibri">
+    <w:panose1 w:val="020F0502020204030204"/>
     <w:charset w:val="00"/>
     <w:family w:val="swiss"/>
     <w:pitch w:val="variable"/>
@@ -7505,6 +7560,7 @@
     <w:rsidRoot w:val="00491E33"/>
     <w:rsid w:val="00065102"/>
     <w:rsid w:val="000A66F8"/>
+    <w:rsid w:val="00165DFF"/>
     <w:rsid w:val="00262083"/>
     <w:rsid w:val="002C67FD"/>
     <w:rsid w:val="0036297D"/>
@@ -7524,6 +7580,7 @@
     <w:rsid w:val="00B935F1"/>
     <w:rsid w:val="00BE5B2E"/>
     <w:rsid w:val="00C36843"/>
+    <w:rsid w:val="00C401BF"/>
     <w:rsid w:val="00C50132"/>
     <w:rsid w:val="00CA7DFC"/>
     <w:rsid w:val="00DE25B0"/>

</xml_diff>

<commit_message>
Añadiendo enlace de oneDrive para acceder a archivos de otras assignaturas
</commit_message>
<xml_diff>
--- a/Proyecto.docx
+++ b/Proyecto.docx
@@ -1876,23 +1876,7 @@
           <w:rFonts w:eastAsiaTheme="minorEastAsia"/>
           <w:color w:val="000000" w:themeColor="text1"/>
         </w:rPr>
-        <w:t xml:space="preserve">Video del </w:t>
-      </w:r>
-      <w:proofErr w:type="spellStart"/>
-      <w:r>
-        <w:rPr>
-          <w:rFonts w:eastAsiaTheme="minorEastAsia"/>
-          <w:color w:val="000000" w:themeColor="text1"/>
-        </w:rPr>
-        <w:t>elevator</w:t>
-      </w:r>
-      <w:proofErr w:type="spellEnd"/>
-      <w:r>
-        <w:rPr>
-          <w:rFonts w:eastAsiaTheme="minorEastAsia"/>
-          <w:color w:val="000000" w:themeColor="text1"/>
-        </w:rPr>
-        <w:t xml:space="preserve"> pitch</w:t>
+        <w:t>Video del elevator pitch</w:t>
       </w:r>
       <w:bookmarkEnd w:id="4"/>
     </w:p>
@@ -2077,14 +2061,12 @@
         </w:tabs>
       </w:pPr>
       <w:hyperlink r:id="rId15" w:history="1">
-        <w:proofErr w:type="spellStart"/>
         <w:r>
           <w:rPr>
             <w:rStyle w:val="Hipervnculo"/>
           </w:rPr>
           <w:t>ayuda_al_viajero.sql</w:t>
         </w:r>
-        <w:proofErr w:type="spellEnd"/>
       </w:hyperlink>
     </w:p>
     <w:p>
@@ -2147,17 +2129,8 @@
           <w:rFonts w:eastAsiaTheme="minorEastAsia"/>
           <w:color w:val="000000" w:themeColor="text1"/>
         </w:rPr>
-        <w:t xml:space="preserve">Proyecto </w:t>
+        <w:t>Proyecto Intermodular</w:t>
       </w:r>
-      <w:proofErr w:type="spellStart"/>
-      <w:r>
-        <w:rPr>
-          <w:rFonts w:eastAsiaTheme="minorEastAsia"/>
-          <w:color w:val="000000" w:themeColor="text1"/>
-        </w:rPr>
-        <w:t>Intermodular</w:t>
-      </w:r>
-      <w:proofErr w:type="spellEnd"/>
       <w:r>
         <w:rPr>
           <w:rFonts w:eastAsiaTheme="minorEastAsia"/>
@@ -2208,9 +2181,27 @@
           <w:tab w:val="left" w:pos="4114"/>
         </w:tabs>
         <w:rPr>
-          <w:rFonts w:eastAsiaTheme="minorEastAsia"/>
-        </w:rPr>
-      </w:pPr>
+          <w:rFonts w:ascii="Calibri" w:eastAsiaTheme="minorEastAsia" w:hAnsi="Calibri" w:cs="Calibri"/>
+          <w:sz w:val="32"/>
+          <w:szCs w:val="32"/>
+        </w:rPr>
+      </w:pPr>
+      <w:r>
+        <w:rPr>
+          <w:rFonts w:ascii="Calibri" w:eastAsiaTheme="minorEastAsia" w:hAnsi="Calibri" w:cs="Calibri"/>
+          <w:sz w:val="32"/>
+          <w:szCs w:val="32"/>
+        </w:rPr>
+        <w:t xml:space="preserve">Enlace de Onedrive </w:t>
+      </w:r>
+      <w:r>
+        <w:rPr>
+          <w:rFonts w:ascii="Calibri" w:eastAsiaTheme="minorEastAsia" w:hAnsi="Calibri" w:cs="Calibri"/>
+          <w:sz w:val="32"/>
+          <w:szCs w:val="32"/>
+        </w:rPr>
+        <w:t>(usar para tener acceso a los archivos de otras asignaturas)</w:t>
+      </w:r>
     </w:p>
     <w:p>
       <w:pPr>
@@ -2223,6 +2214,17 @@
           <w:szCs w:val="36"/>
         </w:rPr>
       </w:pPr>
+      <w:hyperlink r:id="rId19" w:history="1">
+        <w:r>
+          <w:rPr>
+            <w:rStyle w:val="Hipervnculo"/>
+            <w:rFonts w:eastAsiaTheme="minorEastAsia"/>
+            <w:sz w:val="36"/>
+            <w:szCs w:val="36"/>
+          </w:rPr>
+          <w:t>Proyecto Final</w:t>
+        </w:r>
+      </w:hyperlink>
     </w:p>
     <w:p>
       <w:pPr>
@@ -2237,10 +2239,10 @@
       </w:pPr>
     </w:p>
     <w:sectPr>
-      <w:headerReference w:type="default" r:id="rId19"/>
-      <w:footerReference w:type="default" r:id="rId20"/>
-      <w:headerReference w:type="first" r:id="rId21"/>
-      <w:footerReference w:type="first" r:id="rId22"/>
+      <w:headerReference w:type="default" r:id="rId20"/>
+      <w:footerReference w:type="default" r:id="rId21"/>
+      <w:headerReference w:type="first" r:id="rId22"/>
+      <w:footerReference w:type="first" r:id="rId23"/>
       <w:pgSz w:w="11906" w:h="16838"/>
       <w:pgMar w:top="720" w:right="720" w:bottom="720" w:left="720" w:header="510" w:footer="227" w:gutter="0"/>
       <w:cols w:space="708"/>
@@ -7860,7 +7862,6 @@
   <w:style w:type="character" w:default="1" w:styleId="Fuentedeprrafopredeter">
     <w:name w:val="Default Paragraph Font"/>
     <w:uiPriority w:val="1"/>
-    <w:semiHidden/>
     <w:unhideWhenUsed/>
   </w:style>
   <w:style w:type="table" w:default="1" w:styleId="Tablanormal">
@@ -8472,7 +8473,9 @@
     <w:rsid w:val="00165DFF"/>
     <w:rsid w:val="00262083"/>
     <w:rsid w:val="002C67FD"/>
+    <w:rsid w:val="0033335F"/>
     <w:rsid w:val="0036297D"/>
+    <w:rsid w:val="003C2B61"/>
     <w:rsid w:val="003F7062"/>
     <w:rsid w:val="004746D1"/>
     <w:rsid w:val="00477F95"/>

</xml_diff>